<commit_message>
mejorar al prompt y agrego campos al SDD
</commit_message>
<xml_diff>
--- a/templates/SDD.docx
+++ b/templates/SDD.docx
@@ -119,7 +119,7 @@
           <w:lang w:val="es-AR" w:eastAsia="es-AR"/>
         </w:rPr>
         <w:drawing>
-          <wp:anchor distT="0" distB="0" distL="114300" distR="114300" simplePos="0" relativeHeight="251658240" behindDoc="1" locked="0" layoutInCell="1" allowOverlap="1" wp14:anchorId="6C4DC211" wp14:editId="750D9FD9">
+          <wp:anchor distT="0" distB="0" distL="114300" distR="114300" simplePos="0" relativeHeight="251658240" behindDoc="1" locked="0" layoutInCell="1" allowOverlap="1" wp14:anchorId="6C4DC211" wp14:editId="547C7109">
             <wp:simplePos x="0" y="0"/>
             <wp:positionH relativeFrom="column">
               <wp:posOffset>1998345</wp:posOffset>
@@ -425,17 +425,17 @@
     </w:p>
     <w:tbl>
       <w:tblPr>
-        <w:tblW w:w="10326" w:type="dxa"/>
+        <w:tblW w:w="9900" w:type="dxa"/>
         <w:tblLook w:val="01E0" w:firstRow="1" w:lastRow="1" w:firstColumn="1" w:lastColumn="1" w:noHBand="0" w:noVBand="0"/>
       </w:tblPr>
       <w:tblGrid>
-        <w:gridCol w:w="2444"/>
-        <w:gridCol w:w="1229"/>
-        <w:gridCol w:w="1374"/>
-        <w:gridCol w:w="1301"/>
-        <w:gridCol w:w="1374"/>
-        <w:gridCol w:w="1388"/>
-        <w:gridCol w:w="1216"/>
+        <w:gridCol w:w="1817"/>
+        <w:gridCol w:w="1152"/>
+        <w:gridCol w:w="1359"/>
+        <w:gridCol w:w="1612"/>
+        <w:gridCol w:w="1620"/>
+        <w:gridCol w:w="1350"/>
+        <w:gridCol w:w="990"/>
       </w:tblGrid>
       <w:tr>
         <w:trPr>
@@ -444,7 +444,7 @@
         </w:trPr>
         <w:tc>
           <w:tcPr>
-            <w:tcW w:w="2444" w:type="dxa"/>
+            <w:tcW w:w="1817" w:type="dxa"/>
             <w:tcBorders>
               <w:right w:val="single" w:sz="8" w:space="0" w:color="FFFFFF" w:themeColor="background1"/>
             </w:tcBorders>
@@ -475,7 +475,7 @@
         </w:tc>
         <w:tc>
           <w:tcPr>
-            <w:tcW w:w="1229" w:type="dxa"/>
+            <w:tcW w:w="1152" w:type="dxa"/>
             <w:tcBorders>
               <w:left w:val="single" w:sz="8" w:space="0" w:color="FFFFFF" w:themeColor="background1"/>
               <w:right w:val="single" w:sz="8" w:space="0" w:color="FFFFFF" w:themeColor="background1"/>
@@ -507,7 +507,7 @@
         </w:tc>
         <w:tc>
           <w:tcPr>
-            <w:tcW w:w="1374" w:type="dxa"/>
+            <w:tcW w:w="1359" w:type="dxa"/>
             <w:tcBorders>
               <w:left w:val="single" w:sz="8" w:space="0" w:color="FFFFFF" w:themeColor="background1"/>
               <w:right w:val="single" w:sz="8" w:space="0" w:color="FFFFFF" w:themeColor="background1"/>
@@ -539,7 +539,7 @@
         </w:tc>
         <w:tc>
           <w:tcPr>
-            <w:tcW w:w="1301" w:type="dxa"/>
+            <w:tcW w:w="1612" w:type="dxa"/>
             <w:tcBorders>
               <w:left w:val="single" w:sz="8" w:space="0" w:color="FFFFFF" w:themeColor="background1"/>
               <w:right w:val="single" w:sz="8" w:space="0" w:color="FFFFFF" w:themeColor="background1"/>
@@ -571,7 +571,7 @@
         </w:tc>
         <w:tc>
           <w:tcPr>
-            <w:tcW w:w="1374" w:type="dxa"/>
+            <w:tcW w:w="1620" w:type="dxa"/>
             <w:tcBorders>
               <w:left w:val="single" w:sz="8" w:space="0" w:color="FFFFFF" w:themeColor="background1"/>
               <w:right w:val="single" w:sz="8" w:space="0" w:color="FFFFFF" w:themeColor="background1"/>
@@ -603,7 +603,7 @@
         </w:tc>
         <w:tc>
           <w:tcPr>
-            <w:tcW w:w="1388" w:type="dxa"/>
+            <w:tcW w:w="1350" w:type="dxa"/>
             <w:tcBorders>
               <w:left w:val="single" w:sz="8" w:space="0" w:color="FFFFFF" w:themeColor="background1"/>
             </w:tcBorders>
@@ -634,7 +634,7 @@
         </w:tc>
         <w:tc>
           <w:tcPr>
-            <w:tcW w:w="1216" w:type="dxa"/>
+            <w:tcW w:w="990" w:type="dxa"/>
             <w:tcBorders>
               <w:left w:val="single" w:sz="8" w:space="0" w:color="FFFFFF" w:themeColor="background1"/>
             </w:tcBorders>
@@ -670,7 +670,7 @@
         </w:trPr>
         <w:tc>
           <w:tcPr>
-            <w:tcW w:w="2444" w:type="dxa"/>
+            <w:tcW w:w="1817" w:type="dxa"/>
             <w:tcBorders>
               <w:bottom w:val="single" w:sz="8" w:space="0" w:color="FFFFFF" w:themeColor="text1" w:themeTint="00" w:themeShade="00"/>
               <w:right w:val="single" w:sz="8" w:space="0" w:color="FFFFFF" w:themeColor="text1" w:themeTint="00" w:themeShade="00"/>
@@ -757,7 +757,7 @@
         </w:tc>
         <w:tc>
           <w:tcPr>
-            <w:tcW w:w="1229" w:type="dxa"/>
+            <w:tcW w:w="1152" w:type="dxa"/>
             <w:tcBorders>
               <w:left w:val="single" w:sz="8" w:space="0" w:color="FFFFFF" w:themeColor="text1" w:themeTint="00" w:themeShade="00"/>
               <w:bottom w:val="single" w:sz="8" w:space="0" w:color="FFFFFF" w:themeColor="text1" w:themeTint="00" w:themeShade="00"/>
@@ -777,7 +777,7 @@
         </w:tc>
         <w:tc>
           <w:tcPr>
-            <w:tcW w:w="1374" w:type="dxa"/>
+            <w:tcW w:w="1359" w:type="dxa"/>
             <w:tcBorders>
               <w:left w:val="single" w:sz="8" w:space="0" w:color="FFFFFF" w:themeColor="text1" w:themeTint="00" w:themeShade="00"/>
               <w:bottom w:val="single" w:sz="8" w:space="0" w:color="FFFFFF" w:themeColor="text1" w:themeTint="00" w:themeShade="00"/>
@@ -797,7 +797,7 @@
         </w:tc>
         <w:tc>
           <w:tcPr>
-            <w:tcW w:w="1301" w:type="dxa"/>
+            <w:tcW w:w="1612" w:type="dxa"/>
             <w:tcBorders>
               <w:left w:val="single" w:sz="8" w:space="0" w:color="FFFFFF" w:themeColor="text1" w:themeTint="00" w:themeShade="00"/>
               <w:bottom w:val="single" w:sz="8" w:space="0" w:color="FFFFFF" w:themeColor="text1" w:themeTint="00" w:themeShade="00"/>
@@ -817,7 +817,7 @@
         </w:tc>
         <w:tc>
           <w:tcPr>
-            <w:tcW w:w="1374" w:type="dxa"/>
+            <w:tcW w:w="1620" w:type="dxa"/>
             <w:tcBorders>
               <w:left w:val="single" w:sz="8" w:space="0" w:color="FFFFFF" w:themeColor="text1" w:themeTint="00" w:themeShade="00"/>
               <w:bottom w:val="single" w:sz="8" w:space="0" w:color="FFFFFF" w:themeColor="text1" w:themeTint="00" w:themeShade="00"/>
@@ -837,7 +837,7 @@
         </w:tc>
         <w:tc>
           <w:tcPr>
-            <w:tcW w:w="1388" w:type="dxa"/>
+            <w:tcW w:w="1350" w:type="dxa"/>
             <w:tcBorders>
               <w:left w:val="single" w:sz="8" w:space="0" w:color="FFFFFF" w:themeColor="text1" w:themeTint="00" w:themeShade="00"/>
               <w:bottom w:val="single" w:sz="8" w:space="0" w:color="FFFFFF" w:themeColor="text1" w:themeTint="00" w:themeShade="00"/>
@@ -856,7 +856,7 @@
         </w:tc>
         <w:tc>
           <w:tcPr>
-            <w:tcW w:w="1216" w:type="dxa"/>
+            <w:tcW w:w="990" w:type="dxa"/>
             <w:tcBorders>
               <w:left w:val="single" w:sz="8" w:space="0" w:color="FFFFFF" w:themeColor="text1" w:themeTint="00" w:themeShade="00"/>
               <w:bottom w:val="single" w:sz="8" w:space="0" w:color="FFFFFF" w:themeColor="text1" w:themeTint="00" w:themeShade="00"/>
@@ -880,7 +880,7 @@
         </w:trPr>
         <w:tc>
           <w:tcPr>
-            <w:tcW w:w="2444" w:type="dxa"/>
+            <w:tcW w:w="1817" w:type="dxa"/>
             <w:tcBorders>
               <w:right w:val="single" w:sz="8" w:space="0" w:color="FFFFFF" w:themeColor="text1" w:themeTint="00" w:themeShade="00"/>
             </w:tcBorders>
@@ -932,7 +932,7 @@
         </w:tc>
         <w:tc>
           <w:tcPr>
-            <w:tcW w:w="1229" w:type="dxa"/>
+            <w:tcW w:w="1152" w:type="dxa"/>
             <w:tcBorders>
               <w:left w:val="single" w:sz="8" w:space="0" w:color="FFFFFF" w:themeColor="text1" w:themeTint="00" w:themeShade="00"/>
               <w:right w:val="single" w:sz="8" w:space="0" w:color="FFFFFF" w:themeColor="text1" w:themeTint="00" w:themeShade="00"/>
@@ -990,7 +990,7 @@
         </w:tc>
         <w:tc>
           <w:tcPr>
-            <w:tcW w:w="1374" w:type="dxa"/>
+            <w:tcW w:w="1359" w:type="dxa"/>
             <w:tcBorders>
               <w:left w:val="single" w:sz="8" w:space="0" w:color="FFFFFF" w:themeColor="text1" w:themeTint="00" w:themeShade="00"/>
               <w:right w:val="single" w:sz="8" w:space="0" w:color="FFFFFF" w:themeColor="text1" w:themeTint="00" w:themeShade="00"/>
@@ -1048,7 +1048,7 @@
         </w:tc>
         <w:tc>
           <w:tcPr>
-            <w:tcW w:w="1301" w:type="dxa"/>
+            <w:tcW w:w="1612" w:type="dxa"/>
             <w:tcBorders>
               <w:left w:val="single" w:sz="8" w:space="0" w:color="FFFFFF" w:themeColor="text1" w:themeTint="00" w:themeShade="00"/>
               <w:right w:val="single" w:sz="8" w:space="0" w:color="FFFFFF" w:themeColor="text1" w:themeTint="00" w:themeShade="00"/>
@@ -1106,7 +1106,7 @@
         </w:tc>
         <w:tc>
           <w:tcPr>
-            <w:tcW w:w="1374" w:type="dxa"/>
+            <w:tcW w:w="1620" w:type="dxa"/>
             <w:tcBorders>
               <w:left w:val="single" w:sz="8" w:space="0" w:color="FFFFFF" w:themeColor="text1" w:themeTint="00" w:themeShade="00"/>
               <w:right w:val="single" w:sz="8" w:space="0" w:color="FFFFFF" w:themeColor="text1" w:themeTint="00" w:themeShade="00"/>
@@ -1164,7 +1164,7 @@
         </w:tc>
         <w:tc>
           <w:tcPr>
-            <w:tcW w:w="1388" w:type="dxa"/>
+            <w:tcW w:w="1350" w:type="dxa"/>
             <w:tcBorders>
               <w:left w:val="single" w:sz="8" w:space="0" w:color="FFFFFF" w:themeColor="text1" w:themeTint="00" w:themeShade="00"/>
             </w:tcBorders>
@@ -1230,7 +1230,7 @@
         </w:tc>
         <w:tc>
           <w:tcPr>
-            <w:tcW w:w="1216" w:type="dxa"/>
+            <w:tcW w:w="990" w:type="dxa"/>
             <w:tcBorders>
               <w:left w:val="single" w:sz="8" w:space="0" w:color="FFFFFF" w:themeColor="text1" w:themeTint="00" w:themeShade="00"/>
             </w:tcBorders>
@@ -1288,7 +1288,7 @@
         </w:trPr>
         <w:tc>
           <w:tcPr>
-            <w:tcW w:w="2444" w:type="dxa"/>
+            <w:tcW w:w="1817" w:type="dxa"/>
             <w:tcBorders>
               <w:bottom w:val="single" w:sz="8" w:space="0" w:color="FFFFFF" w:themeColor="text1" w:themeTint="00" w:themeShade="00"/>
               <w:right w:val="single" w:sz="8" w:space="0" w:color="FFFFFF" w:themeColor="text1" w:themeTint="00" w:themeShade="00"/>
@@ -1331,7 +1331,7 @@
         </w:tc>
         <w:tc>
           <w:tcPr>
-            <w:tcW w:w="1229" w:type="dxa"/>
+            <w:tcW w:w="1152" w:type="dxa"/>
             <w:tcBorders>
               <w:left w:val="single" w:sz="8" w:space="0" w:color="FFFFFF" w:themeColor="text1" w:themeTint="00" w:themeShade="00"/>
               <w:bottom w:val="single" w:sz="8" w:space="0" w:color="FFFFFF" w:themeColor="text1" w:themeTint="00" w:themeShade="00"/>
@@ -1352,7 +1352,7 @@
         </w:tc>
         <w:tc>
           <w:tcPr>
-            <w:tcW w:w="1374" w:type="dxa"/>
+            <w:tcW w:w="1359" w:type="dxa"/>
             <w:tcBorders>
               <w:left w:val="single" w:sz="8" w:space="0" w:color="FFFFFF" w:themeColor="text1" w:themeTint="00" w:themeShade="00"/>
               <w:bottom w:val="single" w:sz="8" w:space="0" w:color="FFFFFF" w:themeColor="text1" w:themeTint="00" w:themeShade="00"/>
@@ -1373,7 +1373,7 @@
         </w:tc>
         <w:tc>
           <w:tcPr>
-            <w:tcW w:w="1301" w:type="dxa"/>
+            <w:tcW w:w="1612" w:type="dxa"/>
             <w:tcBorders>
               <w:left w:val="single" w:sz="8" w:space="0" w:color="FFFFFF" w:themeColor="text1" w:themeTint="00" w:themeShade="00"/>
               <w:bottom w:val="single" w:sz="8" w:space="0" w:color="FFFFFF" w:themeColor="text1" w:themeTint="00" w:themeShade="00"/>
@@ -1394,7 +1394,7 @@
         </w:tc>
         <w:tc>
           <w:tcPr>
-            <w:tcW w:w="1374" w:type="dxa"/>
+            <w:tcW w:w="1620" w:type="dxa"/>
             <w:tcBorders>
               <w:left w:val="single" w:sz="8" w:space="0" w:color="FFFFFF" w:themeColor="text1" w:themeTint="00" w:themeShade="00"/>
               <w:bottom w:val="single" w:sz="8" w:space="0" w:color="FFFFFF" w:themeColor="text1" w:themeTint="00" w:themeShade="00"/>
@@ -1415,7 +1415,7 @@
         </w:tc>
         <w:tc>
           <w:tcPr>
-            <w:tcW w:w="1388" w:type="dxa"/>
+            <w:tcW w:w="1350" w:type="dxa"/>
             <w:tcBorders>
               <w:left w:val="single" w:sz="8" w:space="0" w:color="FFFFFF" w:themeColor="text1" w:themeTint="00" w:themeShade="00"/>
               <w:bottom w:val="single" w:sz="8" w:space="0" w:color="FFFFFF" w:themeColor="text1" w:themeTint="00" w:themeShade="00"/>
@@ -1435,7 +1435,7 @@
         </w:tc>
         <w:tc>
           <w:tcPr>
-            <w:tcW w:w="1216" w:type="dxa"/>
+            <w:tcW w:w="990" w:type="dxa"/>
             <w:tcBorders>
               <w:left w:val="single" w:sz="8" w:space="0" w:color="FFFFFF" w:themeColor="text1" w:themeTint="00" w:themeShade="00"/>
               <w:bottom w:val="single" w:sz="8" w:space="0" w:color="FFFFFF" w:themeColor="text1" w:themeTint="00" w:themeShade="00"/>
@@ -5082,29 +5082,53 @@
       </w:r>
     </w:p>
     <w:p>
-      <w:r>
+      <w:pPr>
+        <w:rPr>
+          <w:lang w:val="es-ES"/>
+        </w:rPr>
+      </w:pPr>
+      <w:r>
+        <w:rPr>
+          <w:lang w:val="es-ES"/>
+        </w:rPr>
         <w:t>{%</w:t>
       </w:r>
       <w:r>
+        <w:rPr>
+          <w:lang w:val="es-ES"/>
+        </w:rPr>
         <w:t>p</w:t>
       </w:r>
       <w:r>
+        <w:rPr>
+          <w:lang w:val="es-ES"/>
+        </w:rPr>
         <w:t xml:space="preserve"> for exc in sol.</w:t>
       </w:r>
-      <w:proofErr w:type="gramStart"/>
-      <w:r>
+      <w:r>
+        <w:rPr>
+          <w:lang w:val="es-ES"/>
+        </w:rPr>
         <w:t>excepciones</w:t>
       </w:r>
       <w:r>
+        <w:rPr>
+          <w:lang w:val="es-ES"/>
+        </w:rPr>
         <w:t xml:space="preserve"> </w:t>
       </w:r>
       <w:r>
+        <w:rPr>
+          <w:lang w:val="es-ES"/>
+        </w:rPr>
         <w:t>%</w:t>
       </w:r>
       <w:r>
+        <w:rPr>
+          <w:lang w:val="es-ES"/>
+        </w:rPr>
         <w:t>}</w:t>
       </w:r>
-      <w:proofErr w:type="gramEnd"/>
     </w:p>
     <w:p>
       <w:pPr>
@@ -5113,6 +5137,7 @@
           <w:b/>
           <w:bCs/>
           <w:color w:val="EE0000"/>
+          <w:lang w:val="es-ES"/>
         </w:rPr>
       </w:pPr>
       <w:r>
@@ -5120,25 +5145,35 @@
           <w:b/>
           <w:bCs/>
           <w:color w:val="EE0000"/>
+          <w:lang w:val="es-ES"/>
         </w:rPr>
         <w:t>{{exc.evento}}</w:t>
       </w:r>
     </w:p>
     <w:p>
-      <w:r>
+      <w:pPr>
+        <w:rPr>
+          <w:lang w:val="es-ES"/>
+        </w:rPr>
+      </w:pPr>
+      <w:r>
+        <w:rPr>
+          <w:lang w:val="es-ES"/>
+        </w:rPr>
         <w:t>{%</w:t>
       </w:r>
       <w:r>
+        <w:rPr>
+          <w:lang w:val="es-ES"/>
+        </w:rPr>
         <w:t>p</w:t>
       </w:r>
       <w:r>
-        <w:t xml:space="preserve"> </w:t>
-      </w:r>
-      <w:proofErr w:type="gramStart"/>
-      <w:r>
-        <w:t>endfor %}</w:t>
-      </w:r>
-      <w:proofErr w:type="gramEnd"/>
+        <w:rPr>
+          <w:lang w:val="es-ES"/>
+        </w:rPr>
+        <w:t xml:space="preserve"> endfor %}</w:t>
+      </w:r>
     </w:p>
     <w:p>
       <w:r>
@@ -5151,13 +5186,8 @@
         <w:t>p</w:t>
       </w:r>
       <w:r>
-        <w:t xml:space="preserve"> </w:t>
-      </w:r>
-      <w:proofErr w:type="gramStart"/>
-      <w:r>
-        <w:t>endfor %}</w:t>
-      </w:r>
-      <w:proofErr w:type="gramEnd"/>
+        <w:t xml:space="preserve"> endfor %}</w:t>
+      </w:r>
     </w:p>
     <w:p>
       <w:pPr>
@@ -5292,23 +5322,7 @@
                 <w:i/>
                 <w:lang w:val="es-ES"/>
               </w:rPr>
-              <w:t>{%</w:t>
-            </w:r>
-            <w:proofErr w:type="spellStart"/>
-            <w:r>
-              <w:rPr>
-                <w:i/>
-                <w:lang w:val="es-ES"/>
-              </w:rPr>
-              <w:t>tr</w:t>
-            </w:r>
-            <w:proofErr w:type="spellEnd"/>
-            <w:r>
-              <w:rPr>
-                <w:i/>
-                <w:lang w:val="es-ES"/>
-              </w:rPr>
-              <w:t xml:space="preserve"> for e in excepciones %}</w:t>
+              <w:t>{%tr for e in excepciones %}</w:t>
             </w:r>
           </w:p>
         </w:tc>
@@ -5520,19 +5534,11 @@
               </w:rPr>
               <w:t>{%</w:t>
             </w:r>
-            <w:proofErr w:type="spellStart"/>
-            <w:r>
-              <w:rPr>
-                <w:lang w:val="es-ES"/>
-              </w:rPr>
-              <w:t>tr</w:t>
-            </w:r>
-            <w:proofErr w:type="spellEnd"/>
-            <w:r>
-              <w:rPr>
-                <w:lang w:val="es-ES"/>
-              </w:rPr>
-              <w:t xml:space="preserve"> </w:t>
+            <w:r>
+              <w:rPr>
+                <w:lang w:val="es-ES"/>
+              </w:rPr>
+              <w:t xml:space="preserve">tr </w:t>
             </w:r>
             <w:r>
               <w:rPr>
@@ -6131,19 +6137,11 @@
               </w:rPr>
               <w:t>{%</w:t>
             </w:r>
-            <w:proofErr w:type="spellStart"/>
-            <w:r>
-              <w:rPr>
-                <w:lang w:val="es-ES"/>
-              </w:rPr>
-              <w:t>tr</w:t>
-            </w:r>
-            <w:proofErr w:type="spellEnd"/>
-            <w:r>
-              <w:rPr>
-                <w:lang w:val="es-ES"/>
-              </w:rPr>
-              <w:t xml:space="preserve"> </w:t>
+            <w:r>
+              <w:rPr>
+                <w:lang w:val="es-ES"/>
+              </w:rPr>
+              <w:t xml:space="preserve">tr </w:t>
             </w:r>
             <w:r>
               <w:rPr>
@@ -6369,19 +6367,17 @@
         </w:rPr>
         <w:t xml:space="preserve">{{ </w:t>
       </w:r>
-      <w:proofErr w:type="spellStart"/>
-      <w:r>
-        <w:rPr>
-          <w:lang w:val="es-ES"/>
-        </w:rPr>
-        <w:t>diagrama_pasos</w:t>
-      </w:r>
-      <w:proofErr w:type="spellEnd"/>
-      <w:r>
-        <w:rPr>
-          <w:lang w:val="es-ES"/>
-        </w:rPr>
-        <w:t xml:space="preserve"> }}</w:t>
+      <w:r>
+        <w:rPr>
+          <w:lang w:val="es-ES"/>
+        </w:rPr>
+        <w:t>diagrama</w:t>
+      </w:r>
+      <w:r>
+        <w:rPr>
+          <w:lang w:val="es-ES"/>
+        </w:rPr>
+        <w:t>_pasos }}</w:t>
       </w:r>
     </w:p>
     <w:p>
@@ -6393,7 +6389,6 @@
     </w:p>
     <w:p>
       <w:pPr>
-        <w:jc w:val="left"/>
         <w:rPr>
           <w:b/>
           <w:lang w:val="es-ES"/>
@@ -6425,46 +6420,49 @@
       <w:pPr>
         <w:jc w:val="left"/>
         <w:rPr>
-          <w:highlight w:val="yellow"/>
-          <w:lang w:val="es-ES"/>
-        </w:rPr>
-      </w:pPr>
-      <w:r>
-        <w:rPr>
-          <w:highlight w:val="yellow"/>
-          <w:lang w:val="es-ES"/>
-        </w:rPr>
-        <w:t xml:space="preserve">Ejemplo de pasos para el proceso de </w:t>
-      </w:r>
-      <w:r>
-        <w:rPr>
-          <w:highlight w:val="yellow"/>
-          <w:lang w:val="es-ES"/>
-        </w:rPr>
-        <w:t>FIN028</w:t>
-      </w:r>
+          <w:b/>
+          <w:lang w:val="es-ES"/>
+        </w:rPr>
+      </w:pPr>
     </w:p>
     <w:p>
       <w:pPr>
-        <w:jc w:val="left"/>
-        <w:rPr>
-          <w:lang w:val="es-ES"/>
-        </w:rPr>
-      </w:pPr>
-      <w:r>
-        <w:rPr>
-          <w:rFonts w:ascii="Times New Roman" w:eastAsia="Times New Roman" w:hAnsi="Times New Roman" w:cs="Times New Roman"/>
+        <w:jc w:val="center"/>
+        <w:rPr>
+          <w:bCs/>
+          <w:lang w:val="es-ES"/>
+        </w:rPr>
+      </w:pPr>
+      <w:r>
+        <w:rPr>
+          <w:bCs/>
+          <w:lang w:val="es-ES"/>
+        </w:rPr>
+        <w:t>{{ diagrama_detalle }}</w:t>
+      </w:r>
+    </w:p>
+    <w:p>
+      <w:pPr>
+        <w:pStyle w:val="Heading2"/>
+      </w:pPr>
+      <w:bookmarkStart w:id="16" w:name="_Toc175751169"/>
+      <w:r>
+        <w:rPr>
           <w:noProof/>
-          <w:color w:val="auto"/>
-          <w:sz w:val="24"/>
-          <w:szCs w:val="24"/>
-          <w:lang w:val="es-AR" w:eastAsia="es-AR"/>
         </w:rPr>
         <w:drawing>
-          <wp:inline distT="0" distB="0" distL="0" distR="0" wp14:anchorId="12D0F9C8" wp14:editId="70F15317">
-            <wp:extent cx="5731510" cy="3556859"/>
-            <wp:effectExtent l="19050" t="19050" r="21590" b="24765"/>
-            <wp:docPr id="1006" name="Imagen 3"/>
+          <wp:anchor distT="0" distB="0" distL="114300" distR="114300" simplePos="0" relativeHeight="251659264" behindDoc="0" locked="0" layoutInCell="1" allowOverlap="1" wp14:anchorId="45B6785D" wp14:editId="634AD1C6">
+            <wp:simplePos x="0" y="0"/>
+            <wp:positionH relativeFrom="column">
+              <wp:posOffset>1562100</wp:posOffset>
+            </wp:positionH>
+            <wp:positionV relativeFrom="paragraph">
+              <wp:posOffset>617220</wp:posOffset>
+            </wp:positionV>
+            <wp:extent cx="2676525" cy="487680"/>
+            <wp:effectExtent l="0" t="0" r="9525" b="7620"/>
+            <wp:wrapTopAndBottom/>
+            <wp:docPr id="1989459956" name="Picture 5"/>
             <wp:cNvGraphicFramePr>
               <a:graphicFrameLocks xmlns:a="http://schemas.openxmlformats.org/drawingml/2006/main" noChangeAspect="1"/>
             </wp:cNvGraphicFramePr>
@@ -6472,13 +6470,13 @@
               <a:graphicData uri="http://schemas.openxmlformats.org/drawingml/2006/picture">
                 <pic:pic xmlns:pic="http://schemas.openxmlformats.org/drawingml/2006/picture">
                   <pic:nvPicPr>
-                    <pic:cNvPr id="0" name="Picture 4"/>
+                    <pic:cNvPr id="0" name="Picture 7"/>
                     <pic:cNvPicPr>
                       <a:picLocks noChangeAspect="1" noChangeArrowheads="1"/>
                     </pic:cNvPicPr>
                   </pic:nvPicPr>
                   <pic:blipFill>
-                    <a:blip r:embed="rId19" cstate="print">
+                    <a:blip r:embed="rId19">
                       <a:extLst>
                         <a:ext uri="{28A0092B-C50C-407E-A947-70E740481C1C}">
                           <a14:useLocalDpi xmlns:a14="http://schemas.microsoft.com/office/drawing/2010/main" val="0"/>
@@ -6493,105 +6491,65 @@
                   <pic:spPr bwMode="auto">
                     <a:xfrm>
                       <a:off x="0" y="0"/>
-                      <a:ext cx="5731510" cy="3556859"/>
+                      <a:ext cx="2676525" cy="487680"/>
                     </a:xfrm>
                     <a:prstGeom prst="rect">
                       <a:avLst/>
                     </a:prstGeom>
                     <a:noFill/>
                     <a:ln>
-                      <a:solidFill>
-                        <a:schemeClr val="accent6">
-                          <a:lumMod val="20000"/>
-                          <a:lumOff val="80000"/>
-                        </a:schemeClr>
-                      </a:solidFill>
+                      <a:noFill/>
                     </a:ln>
                   </pic:spPr>
                 </pic:pic>
               </a:graphicData>
             </a:graphic>
-          </wp:inline>
+            <wp14:sizeRelH relativeFrom="margin">
+              <wp14:pctWidth>0</wp14:pctWidth>
+            </wp14:sizeRelH>
+            <wp14:sizeRelV relativeFrom="margin">
+              <wp14:pctHeight>0</wp14:pctHeight>
+            </wp14:sizeRelV>
+          </wp:anchor>
         </w:drawing>
       </w:r>
+      <w:r>
+        <w:t>Archivo de configuración</w:t>
+      </w:r>
+      <w:r>
+        <w:t xml:space="preserve"> XML/CSV/XLSX</w:t>
+      </w:r>
+      <w:bookmarkEnd w:id="16"/>
     </w:p>
     <w:p>
       <w:pPr>
-        <w:pStyle w:val="Heading2"/>
-      </w:pPr>
-      <w:bookmarkStart w:id="16" w:name="_Toc175751169"/>
-      <w:r>
-        <w:t>Archivo de configuración</w:t>
-      </w:r>
-      <w:r>
-        <w:t xml:space="preserve"> XML/CSV/XLSX</w:t>
-      </w:r>
-      <w:bookmarkEnd w:id="16"/>
-    </w:p>
-    <w:bookmarkStart w:id="17" w:name="_MON_1770573552"/>
-    <w:bookmarkEnd w:id="17"/>
-    <w:p>
-      <w:pPr>
-        <w:jc w:val="center"/>
-        <w:rPr>
-          <w:lang w:val="es-ES"/>
-        </w:rPr>
-      </w:pPr>
-      <w:r>
-        <w:object w:dxaOrig="935" w:dyaOrig="602" w14:anchorId="78C0DDF6">
-          <v:shapetype id="_x0000_t75" coordsize="21600,21600" o:spt="75" o:preferrelative="t" path="m@4@5l@4@11@9@11@9@5xe" filled="f" stroked="f">
-            <v:stroke joinstyle="miter"/>
-            <v:formulas>
-              <v:f eqn="if lineDrawn pixelLineWidth 0"/>
-              <v:f eqn="sum @0 1 0"/>
-              <v:f eqn="sum 0 0 @1"/>
-              <v:f eqn="prod @2 1 2"/>
-              <v:f eqn="prod @3 21600 pixelWidth"/>
-              <v:f eqn="prod @3 21600 pixelHeight"/>
-              <v:f eqn="sum @0 0 1"/>
-              <v:f eqn="prod @6 1 2"/>
-              <v:f eqn="prod @7 21600 pixelWidth"/>
-              <v:f eqn="sum @8 21600 0"/>
-              <v:f eqn="prod @7 21600 pixelHeight"/>
-              <v:f eqn="sum @10 21600 0"/>
-            </v:formulas>
-            <v:path o:extrusionok="f" gradientshapeok="t" o:connecttype="rect"/>
-            <o:lock v:ext="edit" aspectratio="t"/>
-          </v:shapetype>
-          <v:shape id="_x0000_i1025" type="#_x0000_t75" style="width:43.55pt;height:28.45pt" o:ole="">
-            <v:imagedata r:id="rId20" o:title=""/>
-          </v:shape>
-          <o:OLEObject Type="Embed" ProgID="Excel.Sheet.12" ShapeID="_x0000_i1025" DrawAspect="Icon" ObjectID="_1836465041" r:id="rId21"/>
-        </w:object>
-      </w:r>
-      <w:r>
-        <w:rPr>
-          <w:lang w:val="es-ES"/>
-        </w:rPr>
-        <w:br/>
-      </w:r>
+        <w:rPr>
+          <w:sz w:val="2"/>
+          <w:szCs w:val="2"/>
+          <w:lang w:val="es-ES"/>
+        </w:rPr>
+      </w:pPr>
     </w:p>
     <w:p>
       <w:pPr>
         <w:pStyle w:val="Heading2"/>
       </w:pPr>
-      <w:bookmarkStart w:id="18" w:name="_Toc175751170"/>
+      <w:bookmarkStart w:id="17" w:name="_Toc175751170"/>
       <w:r>
         <w:t>Manejo de archivos</w:t>
       </w:r>
-      <w:bookmarkEnd w:id="18"/>
+      <w:bookmarkEnd w:id="17"/>
     </w:p>
     <w:tbl>
       <w:tblPr>
-        <w:tblW w:w="9592" w:type="dxa"/>
-        <w:tblInd w:w="108" w:type="dxa"/>
+        <w:tblW w:w="9000" w:type="dxa"/>
         <w:tblLayout w:type="fixed"/>
         <w:tblLook w:val="01E0" w:firstRow="1" w:lastRow="1" w:firstColumn="1" w:lastColumn="1" w:noHBand="0" w:noVBand="0"/>
       </w:tblPr>
       <w:tblGrid>
-        <w:gridCol w:w="2302"/>
-        <w:gridCol w:w="4597"/>
-        <w:gridCol w:w="2693"/>
+        <w:gridCol w:w="2520"/>
+        <w:gridCol w:w="3960"/>
+        <w:gridCol w:w="2520"/>
       </w:tblGrid>
       <w:tr>
         <w:trPr>
@@ -6600,7 +6558,7 @@
         </w:trPr>
         <w:tc>
           <w:tcPr>
-            <w:tcW w:w="2302" w:type="dxa"/>
+            <w:tcW w:w="2520" w:type="dxa"/>
             <w:tcBorders>
               <w:right w:val="single" w:sz="8" w:space="0" w:color="FFFFFF" w:themeColor="background1"/>
             </w:tcBorders>
@@ -6636,7 +6594,7 @@
         </w:tc>
         <w:tc>
           <w:tcPr>
-            <w:tcW w:w="4597" w:type="dxa"/>
+            <w:tcW w:w="3960" w:type="dxa"/>
             <w:tcBorders>
               <w:right w:val="single" w:sz="8" w:space="0" w:color="FFFFFF" w:themeColor="background1"/>
             </w:tcBorders>
@@ -6672,7 +6630,7 @@
         </w:tc>
         <w:tc>
           <w:tcPr>
-            <w:tcW w:w="2693" w:type="dxa"/>
+            <w:tcW w:w="2520" w:type="dxa"/>
             <w:tcBorders>
               <w:right w:val="single" w:sz="8" w:space="0" w:color="FFFFFF" w:themeColor="background1"/>
             </w:tcBorders>
@@ -6713,7 +6671,7 @@
         </w:trPr>
         <w:tc>
           <w:tcPr>
-            <w:tcW w:w="2302" w:type="dxa"/>
+            <w:tcW w:w="2520" w:type="dxa"/>
             <w:tcBorders>
               <w:top w:val="single" w:sz="8" w:space="0" w:color="7F7F7F" w:themeColor="text1" w:themeTint="80"/>
               <w:bottom w:val="single" w:sz="8" w:space="0" w:color="7F7F7F" w:themeColor="text1" w:themeTint="80"/>
@@ -6727,36 +6685,39 @@
               <w:rPr>
                 <w:rFonts w:ascii="Arial" w:eastAsia="Arial" w:hAnsi="Arial" w:cs="Arial"/>
                 <w:b/>
-                <w:sz w:val="16"/>
-                <w:szCs w:val="16"/>
-                <w:lang w:val="es-419"/>
               </w:rPr>
             </w:pPr>
             <w:r>
               <w:rPr>
-                <w:rFonts w:ascii="Arial" w:eastAsia="Arial" w:hAnsi="Arial" w:cs="Arial"/>
-                <w:b/>
-                <w:sz w:val="16"/>
-                <w:szCs w:val="16"/>
-                <w:lang w:val="es-419"/>
-              </w:rPr>
-              <w:t>Montaje *</w:t>
-            </w:r>
-            <w:r>
-              <w:rPr>
-                <w:rFonts w:ascii="Arial" w:eastAsia="Arial" w:hAnsi="Arial" w:cs="Arial"/>
-                <w:b/>
-                <w:sz w:val="16"/>
-                <w:szCs w:val="16"/>
-                <w:lang w:val="es-419"/>
-              </w:rPr>
-              <w:t>.xlsx</w:t>
+                <w:i/>
+              </w:rPr>
+              <w:t xml:space="preserve">{%tr for a in </w:t>
+            </w:r>
+            <w:proofErr w:type="spellStart"/>
+            <w:r>
+              <w:rPr>
+                <w:i/>
+              </w:rPr>
+              <w:t>archivo</w:t>
+            </w:r>
+            <w:r>
+              <w:rPr>
+                <w:i/>
+              </w:rPr>
+              <w:t>s</w:t>
+            </w:r>
+            <w:proofErr w:type="spellEnd"/>
+            <w:r>
+              <w:rPr>
+                <w:i/>
+              </w:rPr>
+              <w:t xml:space="preserve"> %}</w:t>
             </w:r>
           </w:p>
         </w:tc>
         <w:tc>
           <w:tcPr>
-            <w:tcW w:w="4597" w:type="dxa"/>
+            <w:tcW w:w="3960" w:type="dxa"/>
             <w:tcBorders>
               <w:top w:val="single" w:sz="8" w:space="0" w:color="7F7F7F" w:themeColor="text1" w:themeTint="80"/>
               <w:bottom w:val="single" w:sz="8" w:space="0" w:color="7F7F7F" w:themeColor="text1" w:themeTint="80"/>
@@ -6768,25 +6729,13 @@
               <w:spacing w:before="80"/>
               <w:rPr>
                 <w:rFonts w:cs="Segoe UI"/>
-                <w:sz w:val="16"/>
-                <w:szCs w:val="16"/>
-                <w:lang w:val="es-419"/>
               </w:rPr>
             </w:pPr>
-            <w:r>
-              <w:rPr>
-                <w:rFonts w:cs="Segoe UI"/>
-                <w:sz w:val="16"/>
-                <w:szCs w:val="16"/>
-                <w:lang w:val="es-419"/>
-              </w:rPr>
-              <w:t>Archivos descargados de ALTAS</w:t>
-            </w:r>
           </w:p>
         </w:tc>
         <w:tc>
           <w:tcPr>
-            <w:tcW w:w="2693" w:type="dxa"/>
+            <w:tcW w:w="2520" w:type="dxa"/>
             <w:tcBorders>
               <w:top w:val="single" w:sz="8" w:space="0" w:color="7F7F7F" w:themeColor="text1" w:themeTint="80"/>
               <w:bottom w:val="single" w:sz="8" w:space="0" w:color="7F7F7F" w:themeColor="text1" w:themeTint="80"/>
@@ -6800,51 +6749,8 @@
               <w:rPr>
                 <w:rFonts w:ascii="Arial" w:eastAsia="Arial" w:hAnsi="Arial" w:cs="Arial"/>
                 <w:bCs/>
-                <w:sz w:val="16"/>
-                <w:szCs w:val="16"/>
-                <w:lang w:val="es-419"/>
               </w:rPr>
             </w:pPr>
-            <w:r>
-              <w:rPr>
-                <w:b/>
-                <w:bCs/>
-                <w:sz w:val="16"/>
-                <w:szCs w:val="16"/>
-                <w:lang w:val="es-AR"/>
-              </w:rPr>
-              <w:t>“</w:t>
-            </w:r>
-            <w:r>
-              <w:rPr>
-                <w:b/>
-                <w:bCs/>
-                <w:sz w:val="16"/>
-                <w:szCs w:val="16"/>
-                <w:lang w:val="es-AR"/>
-              </w:rPr>
-              <w:t>Montaje *</w:t>
-            </w:r>
-            <w:r>
-              <w:rPr>
-                <w:b/>
-                <w:bCs/>
-                <w:sz w:val="16"/>
-                <w:szCs w:val="16"/>
-                <w:lang w:val="es-AR"/>
-              </w:rPr>
-              <w:t>.xlsx</w:t>
-            </w:r>
-            <w:r>
-              <w:rPr>
-                <w:b/>
-                <w:bCs/>
-                <w:sz w:val="16"/>
-                <w:szCs w:val="16"/>
-                <w:lang w:val="es-AR"/>
-              </w:rPr>
-              <w:t>”</w:t>
-            </w:r>
           </w:p>
         </w:tc>
       </w:tr>
@@ -6854,7 +6760,7 @@
         </w:trPr>
         <w:tc>
           <w:tcPr>
-            <w:tcW w:w="2302" w:type="dxa"/>
+            <w:tcW w:w="2520" w:type="dxa"/>
             <w:tcBorders>
               <w:top w:val="single" w:sz="8" w:space="0" w:color="7F7F7F" w:themeColor="text1" w:themeTint="80"/>
               <w:bottom w:val="single" w:sz="8" w:space="0" w:color="7F7F7F" w:themeColor="text1" w:themeTint="80"/>
@@ -6868,36 +6774,49 @@
               <w:rPr>
                 <w:rFonts w:ascii="Arial" w:eastAsia="Arial" w:hAnsi="Arial" w:cs="Arial"/>
                 <w:b/>
-                <w:sz w:val="16"/>
-                <w:szCs w:val="16"/>
                 <w:lang w:val="es-ES"/>
               </w:rPr>
             </w:pPr>
             <w:r>
               <w:rPr>
-                <w:rFonts w:ascii="Arial" w:eastAsia="Arial" w:hAnsi="Arial" w:cs="Arial"/>
-                <w:b/>
-                <w:sz w:val="16"/>
-                <w:szCs w:val="16"/>
-                <w:lang w:val="es-ES"/>
-              </w:rPr>
-              <w:t>Body *</w:t>
-            </w:r>
-            <w:r>
-              <w:rPr>
-                <w:rFonts w:ascii="Arial" w:eastAsia="Arial" w:hAnsi="Arial" w:cs="Arial"/>
-                <w:b/>
-                <w:sz w:val="16"/>
-                <w:szCs w:val="16"/>
-                <w:lang w:val="es-ES"/>
-              </w:rPr>
-              <w:t>.xlsx</w:t>
+                <w:rFonts w:cs="Segoe UI"/>
+                <w:lang w:val="es-ES"/>
+              </w:rPr>
+              <w:t>{{</w:t>
+            </w:r>
+            <w:r>
+              <w:rPr>
+                <w:rFonts w:cs="Segoe UI"/>
+                <w:lang w:val="es-ES"/>
+              </w:rPr>
+              <w:t xml:space="preserve"> </w:t>
+            </w:r>
+            <w:r>
+              <w:rPr>
+                <w:rFonts w:cs="Segoe UI"/>
+                <w:lang w:val="es-ES"/>
+              </w:rPr>
+              <w:t>a.nombre</w:t>
+            </w:r>
+            <w:r>
+              <w:rPr>
+                <w:rFonts w:cs="Segoe UI"/>
+                <w:lang w:val="es-ES"/>
+              </w:rPr>
+              <w:t xml:space="preserve"> </w:t>
+            </w:r>
+            <w:r>
+              <w:rPr>
+                <w:rFonts w:cs="Segoe UI"/>
+                <w:lang w:val="es-ES"/>
+              </w:rPr>
+              <w:t>}}</w:t>
             </w:r>
           </w:p>
         </w:tc>
         <w:tc>
           <w:tcPr>
-            <w:tcW w:w="4597" w:type="dxa"/>
+            <w:tcW w:w="3960" w:type="dxa"/>
             <w:tcBorders>
               <w:top w:val="single" w:sz="8" w:space="0" w:color="7F7F7F" w:themeColor="text1" w:themeTint="80"/>
               <w:bottom w:val="single" w:sz="8" w:space="0" w:color="7F7F7F" w:themeColor="text1" w:themeTint="80"/>
@@ -6909,25 +6828,49 @@
               <w:spacing w:before="80"/>
               <w:rPr>
                 <w:rFonts w:cs="Segoe UI"/>
-                <w:sz w:val="16"/>
-                <w:szCs w:val="16"/>
                 <w:lang w:val="es-419"/>
               </w:rPr>
             </w:pPr>
             <w:r>
               <w:rPr>
                 <w:rFonts w:cs="Segoe UI"/>
-                <w:sz w:val="16"/>
-                <w:szCs w:val="16"/>
                 <w:lang w:val="es-419"/>
               </w:rPr>
-              <w:t>Archivos descargados de ATLAS</w:t>
+              <w:t>{{</w:t>
+            </w:r>
+            <w:r>
+              <w:rPr>
+                <w:rFonts w:cs="Segoe UI"/>
+                <w:lang w:val="es-419"/>
+              </w:rPr>
+              <w:t xml:space="preserve"> </w:t>
+            </w:r>
+            <w:r>
+              <w:rPr>
+                <w:rFonts w:cs="Segoe UI"/>
+                <w:lang w:val="es-419"/>
+              </w:rPr>
+              <w:t>a.comentarios</w:t>
+            </w:r>
+            <w:r>
+              <w:rPr>
+                <w:rFonts w:cs="Segoe UI"/>
+                <w:lang w:val="es-419"/>
+              </w:rPr>
+              <w:t xml:space="preserve"> </w:t>
+            </w:r>
+            <w:r>
+              <w:rPr>
+                <w:rFonts w:cs="Segoe UI"/>
+                <w:lang w:val="es-419"/>
+              </w:rPr>
+              <w:t>}}</w:t>
             </w:r>
           </w:p>
         </w:tc>
         <w:tc>
           <w:tcPr>
-            <w:tcW w:w="2693" w:type="dxa"/>
+            <w:tcW w:w="2520" w:type="dxa"/>
             <w:tcBorders>
               <w:top w:val="single" w:sz="8" w:space="0" w:color="7F7F7F" w:themeColor="text1" w:themeTint="80"/>
               <w:bottom w:val="single" w:sz="8" w:space="0" w:color="7F7F7F" w:themeColor="text1" w:themeTint="80"/>
@@ -6940,8 +6883,6 @@
               <w:rPr>
                 <w:b/>
                 <w:bCs/>
-                <w:sz w:val="16"/>
-                <w:szCs w:val="16"/>
                 <w:lang w:val="es-AR"/>
               </w:rPr>
             </w:pPr>
@@ -6949,32 +6890,81 @@
               <w:rPr>
                 <w:b/>
                 <w:bCs/>
-                <w:sz w:val="16"/>
-                <w:szCs w:val="16"/>
                 <w:lang w:val="es-AR"/>
               </w:rPr>
-              <w:t>“</w:t>
-            </w:r>
-            <w:r>
+              <w:t>{{ a.nomenclatura }}</w:t>
+            </w:r>
+          </w:p>
+        </w:tc>
+      </w:tr>
+      <w:tr>
+        <w:trPr>
+          <w:trHeight w:val="367"/>
+        </w:trPr>
+        <w:tc>
+          <w:tcPr>
+            <w:tcW w:w="2520" w:type="dxa"/>
+            <w:tcBorders>
+              <w:top w:val="single" w:sz="8" w:space="0" w:color="7F7F7F" w:themeColor="text1" w:themeTint="80"/>
+              <w:bottom w:val="single" w:sz="8" w:space="0" w:color="7F7F7F" w:themeColor="text1" w:themeTint="80"/>
+              <w:right w:val="single" w:sz="8" w:space="0" w:color="7F7F7F" w:themeColor="text1" w:themeTint="80"/>
+            </w:tcBorders>
+          </w:tcPr>
+          <w:p>
+            <w:pPr>
+              <w:spacing w:before="80"/>
+              <w:jc w:val="left"/>
+              <w:rPr>
+                <w:rFonts w:ascii="Arial" w:eastAsia="Arial" w:hAnsi="Arial" w:cs="Arial"/>
+                <w:b/>
+                <w:lang w:val="es-ES"/>
+              </w:rPr>
+            </w:pPr>
+            <w:r>
+              <w:rPr>
+                <w:lang w:val="es-ES"/>
+              </w:rPr>
+              <w:t>{%tr endfor %}</w:t>
+            </w:r>
+          </w:p>
+        </w:tc>
+        <w:tc>
+          <w:tcPr>
+            <w:tcW w:w="3960" w:type="dxa"/>
+            <w:tcBorders>
+              <w:top w:val="single" w:sz="8" w:space="0" w:color="7F7F7F" w:themeColor="text1" w:themeTint="80"/>
+              <w:bottom w:val="single" w:sz="8" w:space="0" w:color="7F7F7F" w:themeColor="text1" w:themeTint="80"/>
+              <w:right w:val="single" w:sz="8" w:space="0" w:color="7F7F7F" w:themeColor="text1" w:themeTint="80"/>
+            </w:tcBorders>
+          </w:tcPr>
+          <w:p>
+            <w:pPr>
+              <w:spacing w:before="80"/>
+              <w:rPr>
+                <w:rFonts w:cs="Segoe UI"/>
+                <w:lang w:val="es-419"/>
+              </w:rPr>
+            </w:pPr>
+          </w:p>
+        </w:tc>
+        <w:tc>
+          <w:tcPr>
+            <w:tcW w:w="2520" w:type="dxa"/>
+            <w:tcBorders>
+              <w:top w:val="single" w:sz="8" w:space="0" w:color="7F7F7F" w:themeColor="text1" w:themeTint="80"/>
+              <w:bottom w:val="single" w:sz="8" w:space="0" w:color="7F7F7F" w:themeColor="text1" w:themeTint="80"/>
+              <w:right w:val="single" w:sz="8" w:space="0" w:color="FFFFFF" w:themeColor="background1"/>
+            </w:tcBorders>
+          </w:tcPr>
+          <w:p>
+            <w:pPr>
+              <w:spacing w:before="80"/>
               <w:rPr>
                 <w:b/>
                 <w:bCs/>
-                <w:sz w:val="16"/>
-                <w:szCs w:val="16"/>
                 <w:lang w:val="es-AR"/>
               </w:rPr>
-              <w:t>Body *</w:t>
-            </w:r>
-            <w:r>
-              <w:rPr>
-                <w:b/>
-                <w:bCs/>
-                <w:sz w:val="16"/>
-                <w:szCs w:val="16"/>
-                <w:lang w:val="es-AR"/>
-              </w:rPr>
-              <w:t>.xlsx”</w:t>
-            </w:r>
+            </w:pPr>
           </w:p>
         </w:tc>
       </w:tr>
@@ -6983,27 +6973,26 @@
       <w:pPr>
         <w:pStyle w:val="Heading2"/>
       </w:pPr>
-      <w:bookmarkStart w:id="19" w:name="_Toc175751171"/>
-      <w:r>
-        <w:lastRenderedPageBreak/>
+      <w:bookmarkStart w:id="18" w:name="_Toc175751171"/>
+      <w:r>
         <w:t xml:space="preserve">Logs </w:t>
       </w:r>
       <w:r>
         <w:t>de salida del Bot</w:t>
       </w:r>
-      <w:bookmarkEnd w:id="19"/>
+      <w:bookmarkEnd w:id="18"/>
     </w:p>
     <w:tbl>
       <w:tblPr>
-        <w:tblW w:w="9356" w:type="dxa"/>
-        <w:tblInd w:w="108" w:type="dxa"/>
+        <w:tblW w:w="9000" w:type="dxa"/>
         <w:tblLayout w:type="fixed"/>
         <w:tblLook w:val="01E0" w:firstRow="1" w:lastRow="1" w:firstColumn="1" w:lastColumn="1" w:noHBand="0" w:noVBand="0"/>
       </w:tblPr>
       <w:tblGrid>
+        <w:gridCol w:w="108"/>
         <w:gridCol w:w="1985"/>
         <w:gridCol w:w="3402"/>
-        <w:gridCol w:w="3969"/>
+        <w:gridCol w:w="3505"/>
       </w:tblGrid>
       <w:tr>
         <w:trPr>
@@ -7012,7 +7001,8 @@
         </w:trPr>
         <w:tc>
           <w:tcPr>
-            <w:tcW w:w="1985" w:type="dxa"/>
+            <w:tcW w:w="2093" w:type="dxa"/>
+            <w:gridSpan w:val="2"/>
             <w:tcBorders>
               <w:right w:val="single" w:sz="8" w:space="0" w:color="FFFFFF" w:themeColor="background1"/>
             </w:tcBorders>
@@ -7084,7 +7074,7 @@
         </w:tc>
         <w:tc>
           <w:tcPr>
-            <w:tcW w:w="3969" w:type="dxa"/>
+            <w:tcW w:w="3505" w:type="dxa"/>
             <w:tcBorders>
               <w:right w:val="single" w:sz="8" w:space="0" w:color="FFFFFF" w:themeColor="background1"/>
             </w:tcBorders>
@@ -7121,6 +7111,8 @@
       </w:tr>
       <w:tr>
         <w:trPr>
+          <w:gridBefore w:val="1"/>
+          <w:wBefore w:w="108" w:type="dxa"/>
           <w:trHeight w:val="367"/>
         </w:trPr>
         <w:tc>
@@ -7314,7 +7306,7 @@
         </w:tc>
         <w:tc>
           <w:tcPr>
-            <w:tcW w:w="3969" w:type="dxa"/>
+            <w:tcW w:w="3505" w:type="dxa"/>
             <w:tcBorders>
               <w:top w:val="single" w:sz="8" w:space="0" w:color="7F7F7F" w:themeColor="text1" w:themeTint="80"/>
               <w:bottom w:val="single" w:sz="8" w:space="0" w:color="7F7F7F" w:themeColor="text1" w:themeTint="80"/>
@@ -7329,6 +7321,7 @@
                 <w:rFonts w:ascii="Arial" w:eastAsia="Arial" w:hAnsi="Arial" w:cs="Arial"/>
                 <w:sz w:val="16"/>
                 <w:szCs w:val="16"/>
+                <w:lang w:val="es-ES"/>
               </w:rPr>
             </w:pPr>
             <w:r>
@@ -7336,62 +7329,71 @@
                 <w:rFonts w:ascii="Arial" w:eastAsia="Arial" w:hAnsi="Arial" w:cs="Arial"/>
                 <w:sz w:val="16"/>
                 <w:szCs w:val="16"/>
-              </w:rPr>
-              <w:t>VW_</w:t>
+                <w:lang w:val="es-ES"/>
+              </w:rPr>
+              <w:t>{{cliente}}</w:t>
             </w:r>
             <w:r>
               <w:rPr>
                 <w:rFonts w:ascii="Arial" w:eastAsia="Arial" w:hAnsi="Arial" w:cs="Arial"/>
                 <w:sz w:val="16"/>
                 <w:szCs w:val="16"/>
-              </w:rPr>
-              <w:t>PROD002</w:t>
+                <w:lang w:val="es-ES"/>
+              </w:rPr>
+              <w:t>_</w:t>
             </w:r>
             <w:r>
               <w:rPr>
                 <w:rFonts w:ascii="Arial" w:eastAsia="Arial" w:hAnsi="Arial" w:cs="Arial"/>
                 <w:sz w:val="16"/>
                 <w:szCs w:val="16"/>
-              </w:rPr>
-              <w:t>_</w:t>
+                <w:lang w:val="es-ES"/>
+              </w:rPr>
+              <w:t>{{codigoBot}}</w:t>
             </w:r>
             <w:r>
               <w:rPr>
                 <w:rFonts w:ascii="Arial" w:eastAsia="Arial" w:hAnsi="Arial" w:cs="Arial"/>
                 <w:sz w:val="16"/>
                 <w:szCs w:val="16"/>
-              </w:rPr>
-              <w:t>YYYY_</w:t>
+                <w:lang w:val="es-ES"/>
+              </w:rPr>
+              <w:t>_</w:t>
             </w:r>
             <w:r>
               <w:rPr>
                 <w:rFonts w:ascii="Arial" w:eastAsia="Arial" w:hAnsi="Arial" w:cs="Arial"/>
                 <w:sz w:val="16"/>
                 <w:szCs w:val="16"/>
-              </w:rPr>
-              <w:t>MM_</w:t>
+                <w:lang w:val="es-ES"/>
+              </w:rPr>
+              <w:t>YYYY_</w:t>
             </w:r>
             <w:r>
               <w:rPr>
                 <w:rFonts w:ascii="Arial" w:eastAsia="Arial" w:hAnsi="Arial" w:cs="Arial"/>
                 <w:sz w:val="16"/>
                 <w:szCs w:val="16"/>
-              </w:rPr>
-              <w:t>ErrorLogs</w:t>
+                <w:lang w:val="es-ES"/>
+              </w:rPr>
+              <w:t>MM_</w:t>
             </w:r>
             <w:r>
               <w:rPr>
                 <w:rFonts w:ascii="Arial" w:eastAsia="Arial" w:hAnsi="Arial" w:cs="Arial"/>
                 <w:sz w:val="16"/>
                 <w:szCs w:val="16"/>
-              </w:rPr>
-              <w:t>.csv</w:t>
+                <w:lang w:val="es-ES"/>
+              </w:rPr>
+              <w:t>ErrorLogs.csv</w:t>
             </w:r>
           </w:p>
         </w:tc>
       </w:tr>
       <w:tr>
         <w:trPr>
+          <w:gridBefore w:val="1"/>
+          <w:wBefore w:w="108" w:type="dxa"/>
           <w:trHeight w:val="367"/>
         </w:trPr>
         <w:tc>
@@ -7577,7 +7579,7 @@
         </w:tc>
         <w:tc>
           <w:tcPr>
-            <w:tcW w:w="3969" w:type="dxa"/>
+            <w:tcW w:w="3505" w:type="dxa"/>
             <w:tcBorders>
               <w:top w:val="single" w:sz="8" w:space="0" w:color="7F7F7F" w:themeColor="text1" w:themeTint="80"/>
               <w:bottom w:val="single" w:sz="8" w:space="0" w:color="7F7F7F" w:themeColor="text1" w:themeTint="80"/>
@@ -7592,6 +7594,7 @@
                 <w:rFonts w:ascii="Arial" w:eastAsia="Arial" w:hAnsi="Arial" w:cs="Arial"/>
                 <w:sz w:val="16"/>
                 <w:szCs w:val="16"/>
+                <w:lang w:val="es-ES"/>
               </w:rPr>
             </w:pPr>
             <w:r>
@@ -7599,14 +7602,16 @@
                 <w:rFonts w:ascii="Arial" w:eastAsia="Arial" w:hAnsi="Arial" w:cs="Arial"/>
                 <w:sz w:val="16"/>
                 <w:szCs w:val="16"/>
-              </w:rPr>
-              <w:t>VW</w:t>
+                <w:lang w:val="es-ES"/>
+              </w:rPr>
+              <w:t>{{cliente}}</w:t>
             </w:r>
             <w:r>
               <w:rPr>
                 <w:rFonts w:ascii="Arial" w:eastAsia="Arial" w:hAnsi="Arial" w:cs="Arial"/>
                 <w:sz w:val="16"/>
                 <w:szCs w:val="16"/>
+                <w:lang w:val="es-ES"/>
               </w:rPr>
               <w:t>_</w:t>
             </w:r>
@@ -7615,14 +7620,16 @@
                 <w:rFonts w:ascii="Arial" w:eastAsia="Arial" w:hAnsi="Arial" w:cs="Arial"/>
                 <w:sz w:val="16"/>
                 <w:szCs w:val="16"/>
-              </w:rPr>
-              <w:t>PROD002</w:t>
+                <w:lang w:val="es-ES"/>
+              </w:rPr>
+              <w:t>{{codigoBot}}</w:t>
             </w:r>
             <w:r>
               <w:rPr>
                 <w:rFonts w:ascii="Arial" w:eastAsia="Arial" w:hAnsi="Arial" w:cs="Arial"/>
                 <w:sz w:val="16"/>
                 <w:szCs w:val="16"/>
+                <w:lang w:val="es-ES"/>
               </w:rPr>
               <w:t>_</w:t>
             </w:r>
@@ -7631,6 +7638,7 @@
                 <w:rFonts w:ascii="Arial" w:eastAsia="Arial" w:hAnsi="Arial" w:cs="Arial"/>
                 <w:sz w:val="16"/>
                 <w:szCs w:val="16"/>
+                <w:lang w:val="es-ES"/>
               </w:rPr>
               <w:t>YYYY</w:t>
             </w:r>
@@ -7639,6 +7647,7 @@
                 <w:rFonts w:ascii="Arial" w:eastAsia="Arial" w:hAnsi="Arial" w:cs="Arial"/>
                 <w:sz w:val="16"/>
                 <w:szCs w:val="16"/>
+                <w:lang w:val="es-ES"/>
               </w:rPr>
               <w:t>_</w:t>
             </w:r>
@@ -7647,6 +7656,7 @@
                 <w:rFonts w:ascii="Arial" w:eastAsia="Arial" w:hAnsi="Arial" w:cs="Arial"/>
                 <w:sz w:val="16"/>
                 <w:szCs w:val="16"/>
+                <w:lang w:val="es-ES"/>
               </w:rPr>
               <w:t>MM_</w:t>
             </w:r>
@@ -7655,6 +7665,7 @@
                 <w:rFonts w:ascii="Arial" w:eastAsia="Arial" w:hAnsi="Arial" w:cs="Arial"/>
                 <w:sz w:val="16"/>
                 <w:szCs w:val="16"/>
+                <w:lang w:val="es-ES"/>
               </w:rPr>
               <w:t>Log</w:t>
             </w:r>
@@ -7663,6 +7674,7 @@
                 <w:rFonts w:ascii="Arial" w:eastAsia="Arial" w:hAnsi="Arial" w:cs="Arial"/>
                 <w:sz w:val="16"/>
                 <w:szCs w:val="16"/>
+                <w:lang w:val="es-ES"/>
               </w:rPr>
               <w:t>s</w:t>
             </w:r>
@@ -7671,6 +7683,7 @@
                 <w:rFonts w:ascii="Arial" w:eastAsia="Arial" w:hAnsi="Arial" w:cs="Arial"/>
                 <w:sz w:val="16"/>
                 <w:szCs w:val="16"/>
+                <w:lang w:val="es-ES"/>
               </w:rPr>
               <w:t>.csv</w:t>
             </w:r>
@@ -7679,11 +7692,16 @@
       </w:tr>
     </w:tbl>
     <w:p>
-      <w:bookmarkStart w:id="20" w:name="_Análisis_mails_Plazo"/>
-      <w:bookmarkStart w:id="21" w:name="_Análisis_mails_Cierre"/>
-      <w:bookmarkStart w:id="22" w:name="_Toc114667819"/>
+      <w:pPr>
+        <w:rPr>
+          <w:lang w:val="es-ES"/>
+        </w:rPr>
+      </w:pPr>
+      <w:bookmarkStart w:id="19" w:name="_Análisis_mails_Plazo"/>
+      <w:bookmarkStart w:id="20" w:name="_Análisis_mails_Cierre"/>
+      <w:bookmarkStart w:id="21" w:name="_Toc114667819"/>
+      <w:bookmarkEnd w:id="19"/>
       <w:bookmarkEnd w:id="20"/>
-      <w:bookmarkEnd w:id="21"/>
     </w:p>
     <w:p>
       <w:pPr>
@@ -7697,8 +7715,8 @@
           <w:lang w:val="es-ES"/>
         </w:rPr>
       </w:pPr>
-      <w:bookmarkStart w:id="23" w:name="_Toc175751172"/>
-      <w:bookmarkEnd w:id="22"/>
+      <w:bookmarkStart w:id="22" w:name="_Toc175751172"/>
+      <w:bookmarkEnd w:id="21"/>
       <w:r>
         <w:rPr>
           <w:rFonts w:cs="Segoe UI"/>
@@ -7709,7 +7727,6 @@
         <w:lastRenderedPageBreak/>
         <w:t xml:space="preserve">| </w:t>
       </w:r>
-      <w:proofErr w:type="spellStart"/>
       <w:r>
         <w:rPr>
           <w:rFonts w:cs="Segoe UI"/>
@@ -7737,7 +7754,6 @@
         </w:rPr>
         <w:t>requisitos</w:t>
       </w:r>
-      <w:proofErr w:type="spellEnd"/>
       <w:r>
         <w:rPr>
           <w:rFonts w:cs="Segoe UI"/>
@@ -7747,569 +7763,202 @@
         </w:rPr>
         <w:t xml:space="preserve"> técnicos/funcionamiento</w:t>
       </w:r>
+      <w:bookmarkEnd w:id="22"/>
+    </w:p>
+    <w:p>
+      <w:pPr>
+        <w:rPr>
+          <w:lang w:val="es-ES"/>
+        </w:rPr>
+      </w:pPr>
+      <w:r>
+        <w:rPr>
+          <w:lang w:val="es-ES" w:eastAsia="en-US"/>
+        </w:rPr>
+        <w:t xml:space="preserve">El Bot deberá cumplir todos los pre-requisitos incluidos en el documento </w:t>
+      </w:r>
+      <w:r>
+        <w:rPr>
+          <w:lang w:val="es-ES"/>
+        </w:rPr>
+        <w:t>“Estándar pre-requisitos</w:t>
+      </w:r>
+      <w:r>
+        <w:rPr>
+          <w:lang w:val="es-ES"/>
+        </w:rPr>
+        <w:t>”.</w:t>
+      </w:r>
+    </w:p>
+    <w:p>
+      <w:pPr>
+        <w:rPr>
+          <w:lang w:val="es-ES"/>
+        </w:rPr>
+      </w:pPr>
+      <w:r>
+        <w:rPr>
+          <w:lang w:val="es-ES"/>
+        </w:rPr>
+        <w:t xml:space="preserve">Los </w:t>
+      </w:r>
+      <w:r>
+        <w:rPr>
+          <w:lang w:val="es-ES"/>
+        </w:rPr>
+        <w:t>pre-requisitos específicos</w:t>
+      </w:r>
+      <w:r>
+        <w:rPr>
+          <w:lang w:val="es-ES"/>
+        </w:rPr>
+        <w:t xml:space="preserve"> que necesita este Bot son los siguientes:</w:t>
+      </w:r>
+    </w:p>
+    <w:p>
+      <w:r>
+        <w:t xml:space="preserve">{% for </w:t>
+      </w:r>
+      <w:proofErr w:type="spellStart"/>
+      <w:r>
+        <w:t>requisito</w:t>
+      </w:r>
+      <w:proofErr w:type="spellEnd"/>
+      <w:r>
+        <w:t xml:space="preserve"> in </w:t>
+      </w:r>
+      <w:proofErr w:type="spellStart"/>
+      <w:r>
+        <w:t>requisitos</w:t>
+      </w:r>
+      <w:proofErr w:type="spellEnd"/>
+      <w:r>
+        <w:t xml:space="preserve"> %}</w:t>
+      </w:r>
+    </w:p>
+    <w:p>
+      <w:pPr>
+        <w:numPr>
+          <w:ilvl w:val="0"/>
+          <w:numId w:val="48"/>
+        </w:numPr>
+        <w:rPr>
+          <w:lang w:val="es-ES"/>
+        </w:rPr>
+      </w:pPr>
+      <w:r>
+        <w:rPr>
+          <w:lang w:val="es-ES"/>
+        </w:rPr>
+        <w:t xml:space="preserve">{{ </w:t>
+      </w:r>
+      <w:r>
+        <w:rPr>
+          <w:lang w:val="es-ES"/>
+        </w:rPr>
+        <w:t>requisito</w:t>
+      </w:r>
+      <w:r>
+        <w:rPr>
+          <w:lang w:val="es-ES"/>
+        </w:rPr>
+        <w:t xml:space="preserve"> }} </w:t>
+      </w:r>
+    </w:p>
+    <w:p>
+      <w:pPr>
+        <w:rPr>
+          <w:lang w:val="es-ES"/>
+        </w:rPr>
+      </w:pPr>
+      <w:r>
+        <w:rPr>
+          <w:lang w:val="es-ES"/>
+        </w:rPr>
+        <w:t>{% endfor %}</w:t>
+      </w:r>
+    </w:p>
+    <w:p>
+      <w:pPr>
+        <w:spacing w:before="0" w:after="160" w:line="259" w:lineRule="auto"/>
+        <w:jc w:val="left"/>
+        <w:rPr>
+          <w:lang w:val="es-ES"/>
+        </w:rPr>
+      </w:pPr>
+      <w:r>
+        <w:rPr>
+          <w:lang w:val="es-ES"/>
+        </w:rPr>
+        <w:br w:type="page"/>
+      </w:r>
+    </w:p>
+    <w:p>
+      <w:pPr>
+        <w:pStyle w:val="Heading1"/>
+        <w:shd w:val="clear" w:color="auto" w:fill="auto"/>
+        <w:ind w:left="426"/>
+        <w:rPr>
+          <w:rFonts w:cs="Segoe UI"/>
+          <w:smallCaps w:val="0"/>
+          <w:color w:val="E37800"/>
+          <w:lang w:val="es-ES"/>
+        </w:rPr>
+      </w:pPr>
+      <w:bookmarkStart w:id="23" w:name="_Toc175751173"/>
+      <w:r>
+        <w:rPr>
+          <w:rFonts w:cs="Segoe UI"/>
+          <w:smallCaps w:val="0"/>
+          <w:color w:val="E37800"/>
+          <w:lang w:val="es-ES"/>
+        </w:rPr>
+        <w:lastRenderedPageBreak/>
+        <w:t xml:space="preserve">| </w:t>
+      </w:r>
+      <w:r>
+        <w:rPr>
+          <w:rFonts w:cs="Segoe UI"/>
+          <w:smallCaps w:val="0"/>
+          <w:color w:val="E37800"/>
+          <w:lang w:val="es-ES"/>
+        </w:rPr>
+        <w:t xml:space="preserve">Esquemas de </w:t>
+      </w:r>
+      <w:r>
+        <w:rPr>
+          <w:rFonts w:cs="Segoe UI"/>
+          <w:smallCaps w:val="0"/>
+          <w:color w:val="E37800"/>
+          <w:lang w:val="es-ES"/>
+        </w:rPr>
+        <w:t>ejecución</w:t>
+      </w:r>
       <w:bookmarkEnd w:id="23"/>
     </w:p>
     <w:p>
       <w:pPr>
         <w:rPr>
-          <w:lang w:val="es-ES"/>
-        </w:rPr>
-      </w:pPr>
-      <w:r>
-        <w:rPr>
           <w:lang w:val="es-ES" w:eastAsia="en-US"/>
         </w:rPr>
-        <w:t xml:space="preserve">El Bot deberá cumplir todos los </w:t>
-      </w:r>
-      <w:proofErr w:type="spellStart"/>
+      </w:pPr>
       <w:r>
         <w:rPr>
           <w:lang w:val="es-ES" w:eastAsia="en-US"/>
         </w:rPr>
-        <w:t>pre-requisitos</w:t>
-      </w:r>
-      <w:proofErr w:type="spellEnd"/>
+        <w:t>{{</w:t>
+      </w:r>
       <w:r>
         <w:rPr>
           <w:lang w:val="es-ES" w:eastAsia="en-US"/>
         </w:rPr>
-        <w:t xml:space="preserve"> incluidos en el documento </w:t>
-      </w:r>
-      <w:r>
-        <w:rPr>
-          <w:lang w:val="es-ES"/>
-        </w:rPr>
-        <w:t xml:space="preserve">“Estándar </w:t>
-      </w:r>
-      <w:proofErr w:type="spellStart"/>
-      <w:r>
-        <w:rPr>
-          <w:lang w:val="es-ES"/>
-        </w:rPr>
-        <w:t>pre-requisitos</w:t>
-      </w:r>
-      <w:proofErr w:type="spellEnd"/>
-      <w:r>
-        <w:rPr>
-          <w:lang w:val="es-ES"/>
-        </w:rPr>
-        <w:t xml:space="preserve"> (</w:t>
-      </w:r>
-      <w:r>
-        <w:rPr>
-          <w:i/>
-          <w:iCs/>
-          <w:lang w:val="es-ES"/>
-        </w:rPr>
-        <w:t>pegar el hipervínculo o referencia de la documentación</w:t>
-      </w:r>
-      <w:r>
-        <w:rPr>
-          <w:lang w:val="es-ES"/>
-        </w:rPr>
-        <w:t>)”.</w:t>
-      </w:r>
-    </w:p>
-    <w:p>
-      <w:pPr>
-        <w:rPr>
-          <w:lang w:val="es-ES"/>
-        </w:rPr>
-      </w:pPr>
-      <w:r>
-        <w:rPr>
-          <w:lang w:val="es-ES"/>
-        </w:rPr>
-        <w:t xml:space="preserve">Los </w:t>
-      </w:r>
-      <w:proofErr w:type="spellStart"/>
-      <w:r>
-        <w:rPr>
-          <w:highlight w:val="yellow"/>
-          <w:lang w:val="es-ES"/>
-        </w:rPr>
-        <w:t>pre-requisitos</w:t>
-      </w:r>
-      <w:proofErr w:type="spellEnd"/>
-      <w:r>
-        <w:rPr>
-          <w:highlight w:val="yellow"/>
-          <w:lang w:val="es-ES"/>
-        </w:rPr>
-        <w:t xml:space="preserve"> específicos</w:t>
-      </w:r>
-      <w:r>
-        <w:rPr>
-          <w:lang w:val="es-ES"/>
-        </w:rPr>
-        <w:t xml:space="preserve"> que necesita este Bot son los siguientes:</w:t>
-      </w:r>
-    </w:p>
-    <w:p>
-      <w:pPr>
-        <w:rPr>
-          <w:lang w:val="es-ES"/>
-        </w:rPr>
-      </w:pPr>
-      <w:r>
-        <w:rPr>
-          <w:highlight w:val="yellow"/>
-          <w:lang w:val="es-ES"/>
-        </w:rPr>
-        <w:t xml:space="preserve">Ej. de </w:t>
-      </w:r>
-      <w:proofErr w:type="spellStart"/>
-      <w:r>
-        <w:rPr>
-          <w:highlight w:val="yellow"/>
-          <w:lang w:val="es-ES"/>
-        </w:rPr>
-        <w:t>pre-requisitos</w:t>
-      </w:r>
-      <w:proofErr w:type="spellEnd"/>
-      <w:r>
-        <w:rPr>
-          <w:highlight w:val="yellow"/>
-          <w:lang w:val="es-ES"/>
-        </w:rPr>
-        <w:t xml:space="preserve"> para el proceso de PROD002</w:t>
-      </w:r>
-    </w:p>
-    <w:p>
-      <w:pPr>
-        <w:pStyle w:val="ListParagraph"/>
-        <w:numPr>
-          <w:ilvl w:val="0"/>
-          <w:numId w:val="2"/>
-        </w:numPr>
-        <w:rPr>
-          <w:lang w:val="es-ES"/>
-        </w:rPr>
-      </w:pPr>
-      <w:r>
-        <w:rPr>
-          <w:lang w:val="es-ES"/>
-        </w:rPr>
-        <w:t xml:space="preserve">El Bot deberá poder </w:t>
-      </w:r>
-      <w:r>
-        <w:rPr>
-          <w:lang w:val="es-ES"/>
-        </w:rPr>
-        <w:t>recibir</w:t>
-      </w:r>
-      <w:r>
-        <w:rPr>
-          <w:lang w:val="es-ES"/>
-        </w:rPr>
-        <w:t xml:space="preserve"> los correos </w:t>
-      </w:r>
-      <w:r>
-        <w:rPr>
-          <w:lang w:val="es-ES"/>
-        </w:rPr>
-        <w:t xml:space="preserve">con </w:t>
-      </w:r>
-      <w:r>
-        <w:rPr>
-          <w:lang w:val="es-ES"/>
-        </w:rPr>
-        <w:t>las minutas</w:t>
-      </w:r>
-      <w:r>
-        <w:rPr>
-          <w:lang w:val="es-ES"/>
-        </w:rPr>
-        <w:t xml:space="preserve"> a procesar en la casilla del runner designada para ejecutar el proceso</w:t>
-      </w:r>
-      <w:r>
-        <w:rPr>
-          <w:lang w:val="es-ES"/>
-        </w:rPr>
-        <w:t>.</w:t>
-      </w:r>
-    </w:p>
-    <w:p>
-      <w:pPr>
-        <w:pStyle w:val="ListParagraph"/>
-        <w:numPr>
-          <w:ilvl w:val="0"/>
-          <w:numId w:val="2"/>
-        </w:numPr>
-        <w:rPr>
-          <w:lang w:val="es-ES"/>
-        </w:rPr>
-      </w:pPr>
-      <w:r>
-        <w:rPr>
-          <w:lang w:val="es-ES"/>
-        </w:rPr>
-        <w:t>Configuración casilla compartida</w:t>
-      </w:r>
-      <w:r>
-        <w:rPr>
-          <w:lang w:val="es-ES"/>
-        </w:rPr>
-        <w:t>, ¿</w:t>
-      </w:r>
-      <w:proofErr w:type="spellStart"/>
-      <w:r>
-        <w:rPr>
-          <w:lang w:val="es-ES"/>
-        </w:rPr>
-        <w:t>Cual</w:t>
-      </w:r>
-      <w:proofErr w:type="spellEnd"/>
-      <w:r>
-        <w:rPr>
-          <w:lang w:val="es-ES"/>
-        </w:rPr>
-        <w:t xml:space="preserve"> es la casilla? Ej. LEG001</w:t>
-      </w:r>
-    </w:p>
-    <w:p>
-      <w:pPr>
-        <w:pStyle w:val="ListParagraph"/>
-        <w:numPr>
-          <w:ilvl w:val="0"/>
-          <w:numId w:val="2"/>
-        </w:numPr>
-        <w:rPr>
-          <w:lang w:val="es-ES"/>
-        </w:rPr>
-      </w:pPr>
-      <w:r>
-        <w:rPr>
-          <w:lang w:val="es-ES"/>
-        </w:rPr>
-        <w:t xml:space="preserve">¿Necesitamos que exista una carpeta determinada en el Outlook, ej. FIN013, minutas FIN013? </w:t>
-      </w:r>
-    </w:p>
-    <w:p>
-      <w:pPr>
-        <w:spacing w:before="0" w:after="160" w:line="259" w:lineRule="auto"/>
-        <w:jc w:val="left"/>
-        <w:rPr>
-          <w:lang w:val="es-ES"/>
-        </w:rPr>
-      </w:pPr>
-      <w:r>
-        <w:rPr>
-          <w:lang w:val="es-ES"/>
-        </w:rPr>
-        <w:br w:type="page"/>
-      </w:r>
-    </w:p>
-    <w:p>
-      <w:pPr>
-        <w:pStyle w:val="Heading1"/>
-        <w:shd w:val="clear" w:color="auto" w:fill="auto"/>
-        <w:ind w:left="426"/>
-        <w:rPr>
-          <w:rFonts w:cs="Segoe UI"/>
-          <w:smallCaps w:val="0"/>
-          <w:color w:val="E37800"/>
-          <w:lang w:val="es-ES"/>
-        </w:rPr>
-      </w:pPr>
-      <w:bookmarkStart w:id="24" w:name="_Toc175751173"/>
-      <w:r>
-        <w:rPr>
-          <w:rFonts w:cs="Segoe UI"/>
-          <w:smallCaps w:val="0"/>
-          <w:color w:val="E37800"/>
-          <w:lang w:val="es-ES"/>
-        </w:rPr>
-        <w:lastRenderedPageBreak/>
-        <w:t xml:space="preserve">| </w:t>
-      </w:r>
-      <w:r>
-        <w:rPr>
-          <w:rFonts w:cs="Segoe UI"/>
-          <w:smallCaps w:val="0"/>
-          <w:color w:val="E37800"/>
-          <w:lang w:val="es-ES"/>
-        </w:rPr>
-        <w:t xml:space="preserve">Esquemas de </w:t>
-      </w:r>
-      <w:r>
-        <w:rPr>
-          <w:rFonts w:cs="Segoe UI"/>
-          <w:smallCaps w:val="0"/>
-          <w:color w:val="E37800"/>
-          <w:lang w:val="es-ES"/>
-        </w:rPr>
-        <w:t>ejecución</w:t>
-      </w:r>
-      <w:bookmarkEnd w:id="24"/>
-    </w:p>
-    <w:p>
-      <w:pPr>
-        <w:pStyle w:val="ListParagraph"/>
-        <w:numPr>
-          <w:ilvl w:val="0"/>
-          <w:numId w:val="47"/>
-        </w:numPr>
-        <w:spacing w:before="0" w:after="160" w:line="259" w:lineRule="auto"/>
-        <w:ind w:left="567"/>
-        <w:jc w:val="left"/>
-        <w:rPr>
-          <w:highlight w:val="yellow"/>
-          <w:lang w:val="es-ES"/>
-        </w:rPr>
-      </w:pPr>
-      <w:r>
-        <w:rPr>
-          <w:highlight w:val="yellow"/>
-          <w:lang w:val="es-ES"/>
-        </w:rPr>
-        <w:t xml:space="preserve">Cuantas veces se va a ejecutar el </w:t>
-      </w:r>
-      <w:r>
-        <w:rPr>
-          <w:highlight w:val="yellow"/>
-          <w:lang w:val="es-ES"/>
-        </w:rPr>
-        <w:t>Bot</w:t>
-      </w:r>
-      <w:r>
-        <w:rPr>
-          <w:highlight w:val="yellow"/>
-          <w:lang w:val="es-ES"/>
-        </w:rPr>
-        <w:t xml:space="preserve"> </w:t>
-      </w:r>
-      <w:r>
-        <w:rPr>
-          <w:highlight w:val="yellow"/>
-          <w:lang w:val="es-ES"/>
-        </w:rPr>
-        <w:t>¿</w:t>
-      </w:r>
-      <w:r>
-        <w:rPr>
-          <w:highlight w:val="yellow"/>
-          <w:lang w:val="es-ES"/>
-        </w:rPr>
-        <w:t xml:space="preserve">una vez por </w:t>
-      </w:r>
-      <w:r>
-        <w:rPr>
-          <w:highlight w:val="yellow"/>
-          <w:lang w:val="es-ES"/>
-        </w:rPr>
-        <w:t>día</w:t>
-      </w:r>
-      <w:r>
-        <w:rPr>
-          <w:highlight w:val="yellow"/>
-          <w:lang w:val="es-ES"/>
-        </w:rPr>
-        <w:t>, dos</w:t>
-      </w:r>
-      <w:r>
-        <w:rPr>
-          <w:highlight w:val="yellow"/>
-          <w:lang w:val="es-ES"/>
-        </w:rPr>
-        <w:t>, una vez a la semana una vez al mes</w:t>
-      </w:r>
-      <w:r>
-        <w:rPr>
-          <w:highlight w:val="yellow"/>
-          <w:lang w:val="es-ES"/>
-        </w:rPr>
-        <w:t>?</w:t>
-      </w:r>
-    </w:p>
-    <w:p>
-      <w:pPr>
-        <w:pStyle w:val="ListParagraph"/>
-        <w:numPr>
-          <w:ilvl w:val="0"/>
-          <w:numId w:val="47"/>
-        </w:numPr>
-        <w:spacing w:before="0" w:after="160" w:line="259" w:lineRule="auto"/>
-        <w:ind w:left="567"/>
-        <w:jc w:val="left"/>
-        <w:rPr>
-          <w:highlight w:val="yellow"/>
-          <w:lang w:val="es-ES"/>
-        </w:rPr>
-      </w:pPr>
-      <w:r>
-        <w:rPr>
-          <w:highlight w:val="yellow"/>
-          <w:lang w:val="es-ES"/>
-        </w:rPr>
-        <w:t xml:space="preserve">Si tiene </w:t>
-      </w:r>
-      <w:r>
-        <w:rPr>
-          <w:highlight w:val="yellow"/>
-          <w:lang w:val="es-ES"/>
-        </w:rPr>
-        <w:t>más</w:t>
-      </w:r>
-      <w:r>
-        <w:rPr>
-          <w:highlight w:val="yellow"/>
-          <w:lang w:val="es-ES"/>
-        </w:rPr>
-        <w:t xml:space="preserve"> de una pa</w:t>
-      </w:r>
-      <w:r>
-        <w:rPr>
-          <w:highlight w:val="yellow"/>
-          <w:lang w:val="es-ES"/>
-        </w:rPr>
-        <w:t>rt</w:t>
-      </w:r>
-      <w:r>
-        <w:rPr>
-          <w:highlight w:val="yellow"/>
-          <w:lang w:val="es-ES"/>
-        </w:rPr>
-        <w:t>e</w:t>
-      </w:r>
-      <w:r>
-        <w:rPr>
-          <w:highlight w:val="yellow"/>
-          <w:lang w:val="es-ES"/>
-        </w:rPr>
-        <w:t xml:space="preserve">, </w:t>
-      </w:r>
-      <w:r>
-        <w:rPr>
-          <w:highlight w:val="yellow"/>
-          <w:lang w:val="es-ES"/>
-        </w:rPr>
-        <w:t xml:space="preserve">definir </w:t>
-      </w:r>
-      <w:r>
-        <w:rPr>
-          <w:highlight w:val="yellow"/>
-          <w:lang w:val="es-ES"/>
-        </w:rPr>
-        <w:t xml:space="preserve">como se e diferencia que </w:t>
-      </w:r>
-      <w:r>
-        <w:rPr>
-          <w:highlight w:val="yellow"/>
-          <w:lang w:val="es-ES"/>
-        </w:rPr>
-        <w:t>parte se ejecuta</w:t>
-      </w:r>
-      <w:r>
-        <w:rPr>
-          <w:highlight w:val="yellow"/>
-          <w:lang w:val="es-ES"/>
-        </w:rPr>
-        <w:t>.</w:t>
-      </w:r>
-      <w:r>
-        <w:rPr>
-          <w:highlight w:val="yellow"/>
-          <w:lang w:val="es-ES"/>
-        </w:rPr>
-        <w:t xml:space="preserve"> Ej. Log009</w:t>
-      </w:r>
-    </w:p>
-    <w:p>
-      <w:pPr>
-        <w:pStyle w:val="ListParagraph"/>
-        <w:numPr>
-          <w:ilvl w:val="0"/>
-          <w:numId w:val="47"/>
-        </w:numPr>
-        <w:spacing w:before="0" w:after="160" w:line="259" w:lineRule="auto"/>
-        <w:ind w:left="567"/>
-        <w:jc w:val="left"/>
-        <w:rPr>
-          <w:highlight w:val="yellow"/>
-          <w:lang w:val="es-AR"/>
-        </w:rPr>
-      </w:pPr>
-      <w:r>
-        <w:rPr>
-          <w:highlight w:val="yellow"/>
-          <w:lang w:val="es-AR"/>
-        </w:rPr>
-        <w:t>¿</w:t>
-      </w:r>
-      <w:r>
-        <w:rPr>
-          <w:highlight w:val="yellow"/>
-          <w:lang w:val="es-AR"/>
-        </w:rPr>
-        <w:t>Depende de algo para ejecutarse</w:t>
-      </w:r>
-      <w:r>
-        <w:rPr>
-          <w:highlight w:val="yellow"/>
-          <w:lang w:val="es-AR"/>
-        </w:rPr>
-        <w:t>?</w:t>
-      </w:r>
-    </w:p>
-    <w:p>
-      <w:pPr>
-        <w:pStyle w:val="ListParagraph"/>
-        <w:numPr>
-          <w:ilvl w:val="0"/>
-          <w:numId w:val="47"/>
-        </w:numPr>
-        <w:spacing w:before="0" w:after="160" w:line="259" w:lineRule="auto"/>
-        <w:ind w:left="567"/>
-        <w:jc w:val="left"/>
-        <w:rPr>
-          <w:highlight w:val="yellow"/>
-          <w:lang w:val="es-AR"/>
-        </w:rPr>
-      </w:pPr>
-      <w:r>
-        <w:rPr>
-          <w:highlight w:val="yellow"/>
-          <w:lang w:val="es-AR"/>
-        </w:rPr>
-        <w:t>¿</w:t>
-      </w:r>
-      <w:r>
-        <w:rPr>
-          <w:highlight w:val="yellow"/>
-          <w:lang w:val="es-AR"/>
-        </w:rPr>
-        <w:t xml:space="preserve">La ejecución </w:t>
-      </w:r>
-      <w:r>
-        <w:rPr>
-          <w:highlight w:val="yellow"/>
-          <w:lang w:val="es-AR"/>
-        </w:rPr>
-        <w:t>trabaja con pendientes de la otras ejecuciones?</w:t>
-      </w:r>
-    </w:p>
-    <w:p>
-      <w:pPr>
-        <w:pStyle w:val="ListParagraph"/>
-        <w:numPr>
-          <w:ilvl w:val="0"/>
-          <w:numId w:val="47"/>
-        </w:numPr>
-        <w:spacing w:before="0" w:after="160" w:line="259" w:lineRule="auto"/>
-        <w:ind w:left="567"/>
-        <w:jc w:val="left"/>
-        <w:rPr>
-          <w:highlight w:val="yellow"/>
-          <w:lang w:val="es-AR"/>
-        </w:rPr>
-      </w:pPr>
-      <w:r>
-        <w:rPr>
-          <w:highlight w:val="yellow"/>
-          <w:lang w:val="es-AR"/>
-        </w:rPr>
-        <w:t>Es a demanda, que necesita para ejecutarse Ej. GRC002</w:t>
+        <w:t>r</w:t>
+      </w:r>
+      <w:r>
+        <w:rPr>
+          <w:lang w:val="es-ES" w:eastAsia="en-US"/>
+        </w:rPr>
+        <w:t xml:space="preserve"> ejecucion }}</w:t>
       </w:r>
     </w:p>
     <w:p>
@@ -8328,7 +7977,7 @@
           <w:lang w:val="es-ES"/>
         </w:rPr>
       </w:pPr>
-      <w:bookmarkStart w:id="25" w:name="_Toc175751174"/>
+      <w:bookmarkStart w:id="24" w:name="_Toc175751174"/>
       <w:r>
         <w:rPr>
           <w:rFonts w:cs="Segoe UI"/>
@@ -8347,7 +7996,7 @@
         </w:rPr>
         <w:t>Esquema de Re-ejecución</w:t>
       </w:r>
-      <w:bookmarkEnd w:id="25"/>
+      <w:bookmarkEnd w:id="24"/>
       <w:r>
         <w:rPr>
           <w:rFonts w:cs="Segoe UI"/>
@@ -8360,248 +8009,26 @@
     <w:p>
       <w:pPr>
         <w:rPr>
-          <w:highlight w:val="yellow"/>
           <w:lang w:val="es-ES" w:eastAsia="en-US"/>
         </w:rPr>
       </w:pPr>
       <w:r>
         <w:rPr>
-          <w:highlight w:val="yellow"/>
           <w:lang w:val="es-ES" w:eastAsia="en-US"/>
         </w:rPr>
-        <w:t xml:space="preserve">En este apartado debemos contemplar como </w:t>
-      </w:r>
-      <w:proofErr w:type="spellStart"/>
-      <w:r>
-        <w:rPr>
-          <w:highlight w:val="yellow"/>
+        <w:t>{{</w:t>
+      </w:r>
+      <w:r>
+        <w:rPr>
           <w:lang w:val="es-ES" w:eastAsia="en-US"/>
         </w:rPr>
-        <w:t>re-ejecutar</w:t>
-      </w:r>
-      <w:proofErr w:type="spellEnd"/>
-      <w:r>
-        <w:rPr>
-          <w:highlight w:val="yellow"/>
+        <w:t>r</w:t>
+      </w:r>
+      <w:r>
+        <w:rPr>
           <w:lang w:val="es-ES" w:eastAsia="en-US"/>
         </w:rPr>
-        <w:t xml:space="preserve"> el Bot de la forma más eficiente. </w:t>
-      </w:r>
-    </w:p>
-    <w:p>
-      <w:pPr>
-        <w:rPr>
-          <w:highlight w:val="yellow"/>
-          <w:lang w:val="es-ES" w:eastAsia="en-US"/>
-        </w:rPr>
-      </w:pPr>
-      <w:r>
-        <w:rPr>
-          <w:highlight w:val="yellow"/>
-          <w:lang w:val="es-ES" w:eastAsia="en-US"/>
-        </w:rPr>
-        <w:t>Determinar los casos o las etapas que realiza el Bot durante su ejecución, de forma</w:t>
-      </w:r>
-      <w:r>
-        <w:rPr>
-          <w:highlight w:val="yellow"/>
-          <w:lang w:val="es-ES" w:eastAsia="en-US"/>
-        </w:rPr>
-        <w:t xml:space="preserve"> tal,</w:t>
-      </w:r>
-      <w:r>
-        <w:rPr>
-          <w:highlight w:val="yellow"/>
-          <w:lang w:val="es-ES" w:eastAsia="en-US"/>
-        </w:rPr>
-        <w:t xml:space="preserve"> que al </w:t>
-      </w:r>
-      <w:proofErr w:type="spellStart"/>
-      <w:r>
-        <w:rPr>
-          <w:highlight w:val="yellow"/>
-          <w:lang w:val="es-ES" w:eastAsia="en-US"/>
-        </w:rPr>
-        <w:t>re-ejecutar</w:t>
-      </w:r>
-      <w:proofErr w:type="spellEnd"/>
-      <w:r>
-        <w:rPr>
-          <w:highlight w:val="yellow"/>
-          <w:lang w:val="es-ES" w:eastAsia="en-US"/>
-        </w:rPr>
-        <w:t xml:space="preserve"> el mismo pueda retomar</w:t>
-      </w:r>
-      <w:r>
-        <w:rPr>
-          <w:highlight w:val="yellow"/>
-          <w:lang w:val="es-ES" w:eastAsia="en-US"/>
-        </w:rPr>
-        <w:t xml:space="preserve"> el proceso</w:t>
-      </w:r>
-      <w:r>
-        <w:rPr>
-          <w:highlight w:val="yellow"/>
-          <w:lang w:val="es-ES" w:eastAsia="en-US"/>
-        </w:rPr>
-        <w:t xml:space="preserve"> o solo ejecutar la</w:t>
-      </w:r>
-      <w:r>
-        <w:rPr>
-          <w:highlight w:val="yellow"/>
-          <w:lang w:val="es-ES" w:eastAsia="en-US"/>
-        </w:rPr>
-        <w:t xml:space="preserve"> parte</w:t>
-      </w:r>
-      <w:r>
-        <w:rPr>
-          <w:highlight w:val="yellow"/>
-          <w:lang w:val="es-ES" w:eastAsia="en-US"/>
-        </w:rPr>
-        <w:t xml:space="preserve"> deseada</w:t>
-      </w:r>
-      <w:r>
-        <w:rPr>
-          <w:highlight w:val="yellow"/>
-          <w:lang w:val="es-ES" w:eastAsia="en-US"/>
-        </w:rPr>
-        <w:t>.</w:t>
-      </w:r>
-    </w:p>
-    <w:p>
-      <w:pPr>
-        <w:rPr>
-          <w:highlight w:val="yellow"/>
-          <w:lang w:val="es-ES" w:eastAsia="en-US"/>
-        </w:rPr>
-      </w:pPr>
-    </w:p>
-    <w:p>
-      <w:pPr>
-        <w:pStyle w:val="ListParagraph"/>
-        <w:numPr>
-          <w:ilvl w:val="0"/>
-          <w:numId w:val="46"/>
-        </w:numPr>
-        <w:rPr>
-          <w:highlight w:val="yellow"/>
-          <w:lang w:val="es-ES" w:eastAsia="en-US"/>
-        </w:rPr>
-      </w:pPr>
-      <w:r>
-        <w:rPr>
-          <w:highlight w:val="yellow"/>
-          <w:lang w:val="es-ES" w:eastAsia="en-US"/>
-        </w:rPr>
-        <w:t xml:space="preserve">Identificar etapas/ casos </w:t>
-      </w:r>
-    </w:p>
-    <w:p>
-      <w:pPr>
-        <w:pStyle w:val="ListParagraph"/>
-        <w:numPr>
-          <w:ilvl w:val="0"/>
-          <w:numId w:val="46"/>
-        </w:numPr>
-        <w:rPr>
-          <w:highlight w:val="yellow"/>
-          <w:lang w:val="es-ES" w:eastAsia="en-US"/>
-        </w:rPr>
-      </w:pPr>
-      <w:r>
-        <w:rPr>
-          <w:highlight w:val="yellow"/>
-          <w:lang w:val="es-ES" w:eastAsia="en-US"/>
-        </w:rPr>
-        <w:t xml:space="preserve">¿Cuándo puede </w:t>
-      </w:r>
-      <w:proofErr w:type="spellStart"/>
-      <w:r>
-        <w:rPr>
-          <w:highlight w:val="yellow"/>
-          <w:lang w:val="es-ES" w:eastAsia="en-US"/>
-        </w:rPr>
-        <w:t>re-ejecutar</w:t>
-      </w:r>
-      <w:proofErr w:type="spellEnd"/>
-      <w:r>
-        <w:rPr>
-          <w:highlight w:val="yellow"/>
-          <w:lang w:val="es-ES" w:eastAsia="en-US"/>
-        </w:rPr>
-        <w:t xml:space="preserve">? ¿En qué casos? </w:t>
-      </w:r>
-    </w:p>
-    <w:p>
-      <w:pPr>
-        <w:pStyle w:val="ListParagraph"/>
-        <w:numPr>
-          <w:ilvl w:val="0"/>
-          <w:numId w:val="46"/>
-        </w:numPr>
-        <w:rPr>
-          <w:highlight w:val="yellow"/>
-          <w:lang w:val="es-AR" w:eastAsia="en-US"/>
-        </w:rPr>
-      </w:pPr>
-      <w:r>
-        <w:rPr>
-          <w:highlight w:val="yellow"/>
-          <w:lang w:val="es-AR" w:eastAsia="en-US"/>
-        </w:rPr>
-        <w:t xml:space="preserve">¿Que necesitamos inputs necesitamos para </w:t>
-      </w:r>
-      <w:proofErr w:type="spellStart"/>
-      <w:r>
-        <w:rPr>
-          <w:highlight w:val="yellow"/>
-          <w:lang w:val="es-AR" w:eastAsia="en-US"/>
-        </w:rPr>
-        <w:t>reejutar</w:t>
-      </w:r>
-      <w:proofErr w:type="spellEnd"/>
-      <w:r>
-        <w:rPr>
-          <w:highlight w:val="yellow"/>
-          <w:lang w:val="es-AR" w:eastAsia="en-US"/>
-        </w:rPr>
-        <w:t>?</w:t>
-      </w:r>
-    </w:p>
-    <w:p>
-      <w:pPr>
-        <w:pStyle w:val="ListParagraph"/>
-        <w:numPr>
-          <w:ilvl w:val="0"/>
-          <w:numId w:val="46"/>
-        </w:numPr>
-        <w:rPr>
-          <w:highlight w:val="yellow"/>
-          <w:lang w:val="es-AR" w:eastAsia="en-US"/>
-        </w:rPr>
-      </w:pPr>
-      <w:r>
-        <w:rPr>
-          <w:highlight w:val="yellow"/>
-          <w:lang w:val="es-AR" w:eastAsia="en-US"/>
-        </w:rPr>
-        <w:t xml:space="preserve">¿Debemos recrear un escenario para </w:t>
-      </w:r>
-      <w:proofErr w:type="spellStart"/>
-      <w:r>
-        <w:rPr>
-          <w:highlight w:val="yellow"/>
-          <w:lang w:val="es-AR" w:eastAsia="en-US"/>
-        </w:rPr>
-        <w:t>re-ejecutar</w:t>
-      </w:r>
-      <w:proofErr w:type="spellEnd"/>
-      <w:r>
-        <w:rPr>
-          <w:highlight w:val="yellow"/>
-          <w:lang w:val="es-AR" w:eastAsia="en-US"/>
-        </w:rPr>
-        <w:t xml:space="preserve"> el Bot? </w:t>
+        <w:t xml:space="preserve"> reejecucion }}</w:t>
       </w:r>
     </w:p>
     <w:p>
@@ -8624,7 +8051,7 @@
           <w:lang w:val="es-ES"/>
         </w:rPr>
       </w:pPr>
-      <w:bookmarkStart w:id="26" w:name="_Toc175751175"/>
+      <w:bookmarkStart w:id="25" w:name="_Toc175751175"/>
       <w:r>
         <w:rPr>
           <w:rFonts w:cs="Segoe UI"/>
@@ -8652,496 +8079,498 @@
         </w:rPr>
         <w:t xml:space="preserve"> Excel</w:t>
       </w:r>
+      <w:bookmarkEnd w:id="25"/>
+    </w:p>
+    <w:p>
+      <w:pPr>
+        <w:pStyle w:val="Heading2"/>
+      </w:pPr>
+      <w:bookmarkStart w:id="26" w:name="_Toc175751176"/>
+      <w:r>
+        <w:rPr>
+          <w:noProof/>
+        </w:rPr>
+        <w:drawing>
+          <wp:anchor distT="0" distB="0" distL="114300" distR="114300" simplePos="0" relativeHeight="251661312" behindDoc="0" locked="0" layoutInCell="1" allowOverlap="1" wp14:anchorId="5F56D81C" wp14:editId="0415292B">
+            <wp:simplePos x="0" y="0"/>
+            <wp:positionH relativeFrom="column">
+              <wp:posOffset>1371600</wp:posOffset>
+            </wp:positionH>
+            <wp:positionV relativeFrom="paragraph">
+              <wp:posOffset>609600</wp:posOffset>
+            </wp:positionV>
+            <wp:extent cx="2676525" cy="487680"/>
+            <wp:effectExtent l="0" t="0" r="9525" b="7620"/>
+            <wp:wrapTopAndBottom/>
+            <wp:docPr id="18894962" name="Picture 5"/>
+            <wp:cNvGraphicFramePr>
+              <a:graphicFrameLocks xmlns:a="http://schemas.openxmlformats.org/drawingml/2006/main" noChangeAspect="1"/>
+            </wp:cNvGraphicFramePr>
+            <a:graphic xmlns:a="http://schemas.openxmlformats.org/drawingml/2006/main">
+              <a:graphicData uri="http://schemas.openxmlformats.org/drawingml/2006/picture">
+                <pic:pic xmlns:pic="http://schemas.openxmlformats.org/drawingml/2006/picture">
+                  <pic:nvPicPr>
+                    <pic:cNvPr id="0" name="Picture 7"/>
+                    <pic:cNvPicPr>
+                      <a:picLocks noChangeAspect="1" noChangeArrowheads="1"/>
+                    </pic:cNvPicPr>
+                  </pic:nvPicPr>
+                  <pic:blipFill>
+                    <a:blip r:embed="rId19">
+                      <a:extLst>
+                        <a:ext uri="{28A0092B-C50C-407E-A947-70E740481C1C}">
+                          <a14:useLocalDpi xmlns:a14="http://schemas.microsoft.com/office/drawing/2010/main" val="0"/>
+                        </a:ext>
+                      </a:extLst>
+                    </a:blip>
+                    <a:srcRect/>
+                    <a:stretch>
+                      <a:fillRect/>
+                    </a:stretch>
+                  </pic:blipFill>
+                  <pic:spPr bwMode="auto">
+                    <a:xfrm>
+                      <a:off x="0" y="0"/>
+                      <a:ext cx="2676525" cy="487680"/>
+                    </a:xfrm>
+                    <a:prstGeom prst="rect">
+                      <a:avLst/>
+                    </a:prstGeom>
+                    <a:noFill/>
+                    <a:ln>
+                      <a:noFill/>
+                    </a:ln>
+                  </pic:spPr>
+                </pic:pic>
+              </a:graphicData>
+            </a:graphic>
+            <wp14:sizeRelH relativeFrom="margin">
+              <wp14:pctWidth>0</wp14:pctWidth>
+            </wp14:sizeRelH>
+            <wp14:sizeRelV relativeFrom="margin">
+              <wp14:pctHeight>0</wp14:pctHeight>
+            </wp14:sizeRelV>
+          </wp:anchor>
+        </w:drawing>
+      </w:r>
+      <w:r>
+        <w:t>Propias del negocio (En caso de que llamemos una macro ya creada y utilizado por el negocio Ej. QA001)</w:t>
+      </w:r>
       <w:bookmarkEnd w:id="26"/>
     </w:p>
     <w:p>
       <w:pPr>
-        <w:rPr>
-          <w:lang w:val="es-ES" w:eastAsia="en-US"/>
-        </w:rPr>
-      </w:pPr>
-      <w:r>
-        <w:rPr>
+        <w:ind w:left="360"/>
+        <w:rPr>
+          <w:sz w:val="2"/>
+          <w:szCs w:val="2"/>
           <w:highlight w:val="yellow"/>
-          <w:lang w:val="es-ES" w:eastAsia="en-US"/>
-        </w:rPr>
-        <w:t xml:space="preserve">Las macros </w:t>
-      </w:r>
-      <w:r>
-        <w:rPr>
-          <w:highlight w:val="yellow"/>
-          <w:lang w:val="es-ES" w:eastAsia="en-US"/>
-        </w:rPr>
-        <w:t xml:space="preserve">internas utilizadas por el </w:t>
-      </w:r>
-      <w:proofErr w:type="gramStart"/>
-      <w:r>
-        <w:rPr>
-          <w:highlight w:val="yellow"/>
-          <w:lang w:val="es-ES" w:eastAsia="en-US"/>
-        </w:rPr>
-        <w:t>Bot</w:t>
-      </w:r>
-      <w:r>
-        <w:rPr>
-          <w:highlight w:val="yellow"/>
-          <w:lang w:val="es-ES" w:eastAsia="en-US"/>
-        </w:rPr>
-        <w:t>,</w:t>
-      </w:r>
-      <w:proofErr w:type="gramEnd"/>
-      <w:r>
-        <w:rPr>
-          <w:highlight w:val="yellow"/>
-          <w:lang w:val="es-ES" w:eastAsia="en-US"/>
-        </w:rPr>
-        <w:t xml:space="preserve"> </w:t>
-      </w:r>
-      <w:r>
-        <w:rPr>
-          <w:highlight w:val="yellow"/>
-          <w:lang w:val="es-ES" w:eastAsia="en-US"/>
-        </w:rPr>
-        <w:t xml:space="preserve">deben respetar </w:t>
-      </w:r>
-      <w:r>
-        <w:rPr>
-          <w:highlight w:val="yellow"/>
-          <w:lang w:val="es-ES" w:eastAsia="en-US"/>
-        </w:rPr>
-        <w:t xml:space="preserve">y estar en línea con “estándar buenas </w:t>
-      </w:r>
-      <w:proofErr w:type="spellStart"/>
-      <w:r>
-        <w:rPr>
-          <w:highlight w:val="yellow"/>
-          <w:lang w:val="es-ES" w:eastAsia="en-US"/>
-        </w:rPr>
-        <w:t>practicas</w:t>
-      </w:r>
-      <w:proofErr w:type="spellEnd"/>
-      <w:r>
-        <w:rPr>
-          <w:highlight w:val="yellow"/>
-          <w:lang w:val="es-ES" w:eastAsia="en-US"/>
-        </w:rPr>
-        <w:t xml:space="preserve"> Macros (Poner hipervínculo </w:t>
-      </w:r>
-      <w:r>
-        <w:rPr>
-          <w:highlight w:val="yellow"/>
-          <w:lang w:val="es-ES" w:eastAsia="en-US"/>
-        </w:rPr>
-        <w:t>doc.</w:t>
-      </w:r>
-      <w:r>
-        <w:rPr>
-          <w:highlight w:val="yellow"/>
-          <w:lang w:val="es-ES" w:eastAsia="en-US"/>
-        </w:rPr>
-        <w:t>)”</w:t>
-      </w:r>
+          <w:lang w:val="es-ES"/>
+        </w:rPr>
+      </w:pPr>
     </w:p>
     <w:p>
       <w:pPr>
         <w:pStyle w:val="Heading2"/>
       </w:pPr>
-      <w:bookmarkStart w:id="27" w:name="_Toc175751176"/>
-      <w:r>
-        <w:t>Propias del negocio (En caso de que llamemos una macro ya creada y utilizado por el negocio Ej. QA001)</w:t>
+      <w:bookmarkStart w:id="27" w:name="_Toc175751177"/>
+      <w:r>
+        <w:t>Propias del desarrollo</w:t>
       </w:r>
       <w:bookmarkEnd w:id="27"/>
     </w:p>
     <w:p>
+      <w:r>
+        <w:t>{%</w:t>
+      </w:r>
+      <w:r>
+        <w:t>p</w:t>
+      </w:r>
+      <w:r>
+        <w:t xml:space="preserve"> for </w:t>
+      </w:r>
+      <w:r>
+        <w:t>macro</w:t>
+      </w:r>
+      <w:r>
+        <w:t xml:space="preserve"> in </w:t>
+      </w:r>
+      <w:r>
+        <w:t>macros</w:t>
+      </w:r>
+      <w:r>
+        <w:t xml:space="preserve"> %}</w:t>
+      </w:r>
+    </w:p>
+    <w:p>
+      <w:pPr>
+        <w:rPr>
+          <w:b/>
+          <w:bCs/>
+        </w:rPr>
+      </w:pPr>
+      <w:r>
+        <w:rPr>
+          <w:b/>
+          <w:bCs/>
+        </w:rPr>
+        <w:t xml:space="preserve">Nombre: </w:t>
+      </w:r>
+      <w:r>
+        <w:rPr>
+          <w:b/>
+          <w:bCs/>
+        </w:rPr>
+        <w:t>{{</w:t>
+      </w:r>
+      <w:proofErr w:type="spellStart"/>
+      <w:r>
+        <w:rPr>
+          <w:b/>
+          <w:bCs/>
+        </w:rPr>
+        <w:t>macro.nombre</w:t>
+      </w:r>
+      <w:proofErr w:type="spellEnd"/>
+      <w:r>
+        <w:rPr>
+          <w:b/>
+          <w:bCs/>
+        </w:rPr>
+        <w:t>}}</w:t>
+      </w:r>
+    </w:p>
+    <w:p>
+      <w:pPr>
+        <w:ind w:firstLine="708"/>
+      </w:pPr>
+      <w:proofErr w:type="spellStart"/>
+      <w:r>
+        <w:t>Entorno</w:t>
+      </w:r>
+      <w:proofErr w:type="spellEnd"/>
+      <w:r>
+        <w:t xml:space="preserve">: </w:t>
+      </w:r>
+      <w:r>
+        <w:t>{{</w:t>
+      </w:r>
+      <w:proofErr w:type="spellStart"/>
+      <w:r>
+        <w:t>macro.entorno</w:t>
+      </w:r>
+      <w:proofErr w:type="spellEnd"/>
+      <w:r>
+        <w:t>}}</w:t>
+      </w:r>
+    </w:p>
+    <w:p>
+      <w:pPr>
+        <w:ind w:firstLine="708"/>
+      </w:pPr>
+      <w:r>
+        <w:t>Funciones:</w:t>
+      </w:r>
+    </w:p>
+    <w:p>
+      <w:pPr>
+        <w:ind w:firstLine="708"/>
+      </w:pPr>
+      <w:r>
+        <w:t>{%</w:t>
+      </w:r>
+      <w:r>
+        <w:t>p</w:t>
+      </w:r>
+      <w:r>
+        <w:t xml:space="preserve"> for </w:t>
+      </w:r>
+      <w:proofErr w:type="spellStart"/>
+      <w:r>
+        <w:t>funcion</w:t>
+      </w:r>
+      <w:proofErr w:type="spellEnd"/>
+      <w:r>
+        <w:t xml:space="preserve"> in </w:t>
+      </w:r>
+      <w:proofErr w:type="spellStart"/>
+      <w:r>
+        <w:t>macro.funciones</w:t>
+      </w:r>
+      <w:proofErr w:type="spellEnd"/>
+      <w:r>
+        <w:t xml:space="preserve"> %}</w:t>
+      </w:r>
+    </w:p>
+    <w:p>
       <w:pPr>
         <w:pStyle w:val="ListParagraph"/>
         <w:numPr>
-          <w:ilvl w:val="0"/>
-          <w:numId w:val="37"/>
+          <w:ilvl w:val="1"/>
+          <w:numId w:val="48"/>
         </w:numPr>
-        <w:rPr>
-          <w:highlight w:val="yellow"/>
-          <w:lang w:val="es-ES"/>
-        </w:rPr>
-      </w:pPr>
-      <w:r>
-        <w:rPr>
-          <w:highlight w:val="yellow"/>
-          <w:lang w:val="es-ES"/>
-        </w:rPr>
-        <w:t>Nombre de macro a llamar</w:t>
-      </w:r>
-      <w:r>
-        <w:rPr>
-          <w:highlight w:val="yellow"/>
-          <w:lang w:val="es-ES"/>
-        </w:rPr>
-        <w:t>.</w:t>
+        <w:ind w:left="1080"/>
+        <w:rPr>
+          <w:b/>
+          <w:bCs/>
+        </w:rPr>
+      </w:pPr>
+      <w:r>
+        <w:rPr>
+          <w:b/>
+          <w:bCs/>
+        </w:rPr>
+        <w:t>{</w:t>
+      </w:r>
+      <w:r>
+        <w:rPr>
+          <w:b/>
+          <w:bCs/>
+        </w:rPr>
+        <w:t>{</w:t>
+      </w:r>
+      <w:proofErr w:type="spellStart"/>
+      <w:r>
+        <w:rPr>
+          <w:b/>
+          <w:bCs/>
+        </w:rPr>
+        <w:t>funcion</w:t>
+      </w:r>
+      <w:r>
+        <w:rPr>
+          <w:b/>
+          <w:bCs/>
+        </w:rPr>
+        <w:t>.nombre</w:t>
+      </w:r>
+      <w:proofErr w:type="spellEnd"/>
+      <w:r>
+        <w:rPr>
+          <w:b/>
+          <w:bCs/>
+        </w:rPr>
+        <w:t>}}</w:t>
+      </w:r>
+      <w:r>
+        <w:rPr>
+          <w:b/>
+          <w:bCs/>
+        </w:rPr>
+        <w:t xml:space="preserve">: </w:t>
+      </w:r>
+      <w:r>
+        <w:t>{{</w:t>
+      </w:r>
+      <w:proofErr w:type="spellStart"/>
+      <w:r>
+        <w:t>funcion.resumen</w:t>
+      </w:r>
+      <w:proofErr w:type="spellEnd"/>
+      <w:r>
+        <w:t>}}</w:t>
       </w:r>
     </w:p>
     <w:p>
       <w:pPr>
-        <w:pStyle w:val="ListParagraph"/>
-        <w:numPr>
-          <w:ilvl w:val="0"/>
-          <w:numId w:val="37"/>
-        </w:numPr>
-        <w:rPr>
-          <w:highlight w:val="yellow"/>
-          <w:lang w:val="es-ES"/>
-        </w:rPr>
-      </w:pPr>
-      <w:r>
-        <w:rPr>
-          <w:highlight w:val="yellow"/>
-          <w:lang w:val="es-ES"/>
-        </w:rPr>
-        <w:t>¿</w:t>
-      </w:r>
-      <w:r>
-        <w:rPr>
-          <w:highlight w:val="yellow"/>
-          <w:lang w:val="es-ES"/>
-        </w:rPr>
-        <w:t xml:space="preserve">Se encuentra en el Excel trabajado o está en un Excel </w:t>
-      </w:r>
-      <w:proofErr w:type="gramStart"/>
-      <w:r>
-        <w:rPr>
-          <w:highlight w:val="yellow"/>
-          <w:lang w:val="es-ES"/>
-        </w:rPr>
-        <w:t>externo</w:t>
-      </w:r>
-      <w:r>
-        <w:rPr>
-          <w:highlight w:val="yellow"/>
-          <w:lang w:val="es-ES"/>
-        </w:rPr>
-        <w:t>?</w:t>
-      </w:r>
-      <w:r>
-        <w:rPr>
-          <w:highlight w:val="yellow"/>
-          <w:lang w:val="es-ES"/>
-        </w:rPr>
-        <w:t>.</w:t>
-      </w:r>
-      <w:proofErr w:type="gramEnd"/>
-      <w:r>
-        <w:rPr>
-          <w:highlight w:val="yellow"/>
-          <w:lang w:val="es-ES"/>
-        </w:rPr>
-        <w:t xml:space="preserve"> </w:t>
+        <w:ind w:left="720"/>
+      </w:pPr>
+      <w:r>
+        <w:t>{%</w:t>
+      </w:r>
+      <w:r>
+        <w:t>p</w:t>
+      </w:r>
+      <w:r>
+        <w:t xml:space="preserve"> endfor %</w:t>
+      </w:r>
+      <w:r>
+        <w:t>}</w:t>
       </w:r>
     </w:p>
     <w:p>
       <w:pPr>
-        <w:pStyle w:val="ListParagraph"/>
-        <w:numPr>
-          <w:ilvl w:val="0"/>
-          <w:numId w:val="37"/>
-        </w:numPr>
-        <w:rPr>
-          <w:highlight w:val="yellow"/>
-          <w:lang w:val="es-ES"/>
-        </w:rPr>
-      </w:pPr>
-      <w:r>
-        <w:rPr>
-          <w:highlight w:val="yellow"/>
-          <w:lang w:val="es-ES"/>
-        </w:rPr>
-        <w:t>Condiciones previas a ejecutar la macro, se debe hacer antes de correrla.</w:t>
+        <w:ind w:left="720"/>
+      </w:pPr>
+      <w:proofErr w:type="spellStart"/>
+      <w:r>
+        <w:t>Precondiciones</w:t>
+      </w:r>
+      <w:proofErr w:type="spellEnd"/>
+      <w:r>
+        <w:t>: {{</w:t>
+      </w:r>
+      <w:proofErr w:type="spellStart"/>
+      <w:r>
+        <w:t>macro.condiciones</w:t>
+      </w:r>
+      <w:proofErr w:type="spellEnd"/>
+      <w:r>
+        <w:t>}}</w:t>
       </w:r>
     </w:p>
     <w:p>
       <w:pPr>
-        <w:pStyle w:val="ListParagraph"/>
-        <w:rPr>
-          <w:lang w:val="es-ES"/>
-        </w:rPr>
-      </w:pPr>
-      <w:r>
-        <w:rPr>
-          <w:highlight w:val="yellow"/>
-          <w:lang w:val="es-ES"/>
-        </w:rPr>
-        <w:t>Ej. pegar información de la hoja “A” a la “B”, tener la Info en la columna C, la tabla de hoja 2 (Entre las columnas A2 H56) debe estar vacía, el Bot debe terminar de completar todos los registros previos en la hoja 1, etc.</w:t>
-      </w:r>
-      <w:r>
-        <w:rPr>
-          <w:lang w:val="es-ES"/>
-        </w:rPr>
-        <w:tab/>
+        <w:rPr>
+          <w:lang w:val="es-ES"/>
+        </w:rPr>
+      </w:pPr>
+      <w:r>
+        <w:rPr>
+          <w:lang w:val="es-ES"/>
+        </w:rPr>
+        <w:t>{%</w:t>
+      </w:r>
+      <w:r>
+        <w:rPr>
+          <w:lang w:val="es-ES"/>
+        </w:rPr>
+        <w:t>p</w:t>
+      </w:r>
+      <w:r>
+        <w:rPr>
+          <w:lang w:val="es-ES"/>
+        </w:rPr>
+        <w:t xml:space="preserve"> endfor %}</w:t>
       </w:r>
     </w:p>
     <w:p>
       <w:pPr>
-        <w:pStyle w:val="Heading2"/>
-      </w:pPr>
-      <w:bookmarkStart w:id="28" w:name="_Toc175751177"/>
-      <w:r>
-        <w:t>Propias del desarrollo</w:t>
+        <w:spacing w:before="0" w:after="160" w:line="259" w:lineRule="auto"/>
+        <w:jc w:val="left"/>
+        <w:rPr>
+          <w:lang w:val="es-ES"/>
+        </w:rPr>
+      </w:pPr>
+      <w:r>
+        <w:rPr>
+          <w:lang w:val="es-ES"/>
+        </w:rPr>
+        <w:br w:type="page"/>
+      </w:r>
+    </w:p>
+    <w:p>
+      <w:pPr>
+        <w:pStyle w:val="Heading1"/>
+        <w:shd w:val="clear" w:color="auto" w:fill="auto"/>
+        <w:ind w:left="426"/>
+        <w:rPr>
+          <w:rFonts w:cs="Segoe UI"/>
+          <w:smallCaps w:val="0"/>
+          <w:color w:val="E37800"/>
+          <w:lang w:val="es-ES"/>
+        </w:rPr>
+      </w:pPr>
+      <w:bookmarkStart w:id="28" w:name="_Toc175751178"/>
+      <w:r>
+        <w:rPr>
+          <w:rFonts w:cs="Segoe UI"/>
+          <w:smallCaps w:val="0"/>
+          <w:color w:val="E37800"/>
+          <w:lang w:val="es-ES"/>
+        </w:rPr>
+        <w:lastRenderedPageBreak/>
+        <w:t xml:space="preserve">| </w:t>
+      </w:r>
+      <w:r>
+        <w:rPr>
+          <w:rFonts w:cs="Segoe UI"/>
+          <w:color w:val="E37800"/>
+          <w:lang w:val="es-ES"/>
+        </w:rPr>
+        <w:t>Configuración VM</w:t>
       </w:r>
       <w:bookmarkEnd w:id="28"/>
     </w:p>
     <w:p>
       <w:pPr>
-        <w:pStyle w:val="ListParagraph"/>
-        <w:numPr>
-          <w:ilvl w:val="0"/>
-          <w:numId w:val="37"/>
-        </w:numPr>
+        <w:rPr>
+          <w:lang w:val="es-ES" w:eastAsia="en-US"/>
+        </w:rPr>
+      </w:pPr>
+      <w:r>
+        <w:rPr>
+          <w:lang w:val="es-ES" w:eastAsia="en-US"/>
+        </w:rPr>
+        <w:t xml:space="preserve">Las VM </w:t>
+      </w:r>
+      <w:r>
+        <w:rPr>
+          <w:lang w:val="es-ES" w:eastAsia="en-US"/>
+        </w:rPr>
+        <w:t>deberá</w:t>
+      </w:r>
+      <w:r>
+        <w:rPr>
+          <w:lang w:val="es-ES" w:eastAsia="en-US"/>
+        </w:rPr>
+        <w:t>n tener</w:t>
+      </w:r>
+      <w:r>
+        <w:rPr>
+          <w:lang w:val="es-ES" w:eastAsia="en-US"/>
+        </w:rPr>
+        <w:t xml:space="preserve"> configurado</w:t>
+      </w:r>
+      <w:r>
+        <w:rPr>
+          <w:lang w:val="es-ES" w:eastAsia="en-US"/>
+        </w:rPr>
+        <w:t xml:space="preserve"> por regla general </w:t>
+      </w:r>
+      <w:r>
+        <w:rPr>
+          <w:lang w:val="es-ES" w:eastAsia="en-US"/>
+        </w:rPr>
+        <w:t>“</w:t>
+      </w:r>
+      <w:r>
+        <w:rPr>
+          <w:lang w:val="es-ES" w:eastAsia="en-US"/>
+        </w:rPr>
+        <w:t>estándar configuración</w:t>
+      </w:r>
+      <w:r>
+        <w:rPr>
+          <w:lang w:val="es-ES" w:eastAsia="en-US"/>
+        </w:rPr>
+        <w:t xml:space="preserve"> </w:t>
+      </w:r>
+      <w:r>
+        <w:rPr>
+          <w:lang w:val="es-ES" w:eastAsia="en-US"/>
+        </w:rPr>
+        <w:t>VM en cada ambiente (</w:t>
+      </w:r>
+      <w:r>
         <w:rPr>
           <w:highlight w:val="yellow"/>
-          <w:lang w:val="es-ES"/>
-        </w:rPr>
-      </w:pPr>
-      <w:r>
-        <w:rPr>
-          <w:highlight w:val="yellow"/>
-          <w:lang w:val="es-ES"/>
-        </w:rPr>
-        <w:t xml:space="preserve">Nombre de macro a llamar </w:t>
+          <w:lang w:val="es-ES" w:eastAsia="en-US"/>
+        </w:rPr>
+        <w:t>pegar link hipervínculo</w:t>
+      </w:r>
+      <w:r>
+        <w:rPr>
+          <w:lang w:val="es-ES" w:eastAsia="en-US"/>
+        </w:rPr>
+        <w:t>)”</w:t>
       </w:r>
     </w:p>
     <w:p>
       <w:pPr>
-        <w:pStyle w:val="ListParagraph"/>
-        <w:numPr>
-          <w:ilvl w:val="0"/>
-          <w:numId w:val="37"/>
-        </w:numPr>
-        <w:rPr>
-          <w:highlight w:val="yellow"/>
-          <w:lang w:val="es-ES"/>
-        </w:rPr>
-      </w:pPr>
-      <w:r>
-        <w:rPr>
-          <w:highlight w:val="yellow"/>
-          <w:lang w:val="es-ES"/>
-        </w:rPr>
-        <w:t xml:space="preserve">¿Se encuentra en el Excel trabajado o está en un Excel </w:t>
-      </w:r>
-      <w:proofErr w:type="gramStart"/>
-      <w:r>
-        <w:rPr>
-          <w:highlight w:val="yellow"/>
-          <w:lang w:val="es-ES"/>
-        </w:rPr>
-        <w:t>externo?.</w:t>
-      </w:r>
-      <w:proofErr w:type="gramEnd"/>
-    </w:p>
-    <w:p>
-      <w:pPr>
-        <w:pStyle w:val="ListParagraph"/>
-        <w:numPr>
-          <w:ilvl w:val="0"/>
-          <w:numId w:val="37"/>
-        </w:numPr>
-        <w:rPr>
-          <w:highlight w:val="yellow"/>
-          <w:lang w:val="es-ES"/>
-        </w:rPr>
-      </w:pPr>
-      <w:r>
-        <w:rPr>
-          <w:highlight w:val="yellow"/>
-          <w:lang w:val="es-ES"/>
-        </w:rPr>
-        <w:t>Nombre de Sub/funciones que llama el Bot</w:t>
-      </w:r>
-      <w:r>
-        <w:rPr>
-          <w:highlight w:val="yellow"/>
-          <w:lang w:val="es-ES"/>
-        </w:rPr>
-        <w:t>.</w:t>
-      </w:r>
-      <w:r>
-        <w:rPr>
-          <w:highlight w:val="yellow"/>
-          <w:lang w:val="es-ES"/>
-        </w:rPr>
-        <w:t xml:space="preserve"> (Resumen de que hace cada sub)</w:t>
-      </w:r>
-    </w:p>
-    <w:p>
-      <w:pPr>
-        <w:pStyle w:val="ListParagraph"/>
-        <w:numPr>
-          <w:ilvl w:val="0"/>
-          <w:numId w:val="37"/>
-        </w:numPr>
-        <w:rPr>
-          <w:highlight w:val="yellow"/>
-          <w:lang w:val="es-ES"/>
-        </w:rPr>
-      </w:pPr>
-      <w:r>
-        <w:rPr>
-          <w:highlight w:val="yellow"/>
-          <w:lang w:val="es-ES"/>
-        </w:rPr>
-        <w:t>Condiciones previas a ejecutar la macro, se debe hacer antes de correrla.</w:t>
-      </w:r>
-    </w:p>
-    <w:p>
-      <w:pPr>
-        <w:pStyle w:val="ListParagraph"/>
-        <w:rPr>
-          <w:lang w:val="es-ES"/>
-        </w:rPr>
-      </w:pPr>
-      <w:r>
-        <w:rPr>
-          <w:highlight w:val="yellow"/>
-          <w:lang w:val="es-ES"/>
-        </w:rPr>
-        <w:t>Ej. pegar información de la hoja “A” a la “B”, tener la Info en la columna C, la tabla de hoja 2 (Entre las columnas A2 H56) debe estar vacía, el Bot debe terminar de completar todos los registros previos en la hoja 1, etc.</w:t>
-      </w:r>
-    </w:p>
-    <w:p>
-      <w:pPr>
-        <w:spacing w:before="0" w:after="160" w:line="259" w:lineRule="auto"/>
-        <w:jc w:val="left"/>
-        <w:rPr>
-          <w:lang w:val="es-ES"/>
-        </w:rPr>
-      </w:pPr>
-      <w:r>
-        <w:rPr>
-          <w:lang w:val="es-ES"/>
-        </w:rPr>
-        <w:br w:type="page"/>
-      </w:r>
-    </w:p>
-    <w:p>
-      <w:pPr>
-        <w:pStyle w:val="Heading1"/>
-        <w:shd w:val="clear" w:color="auto" w:fill="auto"/>
-        <w:ind w:left="426"/>
-        <w:rPr>
-          <w:rFonts w:cs="Segoe UI"/>
-          <w:smallCaps w:val="0"/>
-          <w:color w:val="E37800"/>
-          <w:lang w:val="es-ES"/>
-        </w:rPr>
-      </w:pPr>
-      <w:bookmarkStart w:id="29" w:name="_Toc175751178"/>
-      <w:r>
-        <w:rPr>
-          <w:rFonts w:cs="Segoe UI"/>
-          <w:smallCaps w:val="0"/>
-          <w:color w:val="E37800"/>
-          <w:lang w:val="es-ES"/>
-        </w:rPr>
-        <w:lastRenderedPageBreak/>
-        <w:t xml:space="preserve">| </w:t>
-      </w:r>
-      <w:r>
-        <w:rPr>
-          <w:rFonts w:cs="Segoe UI"/>
-          <w:color w:val="E37800"/>
-          <w:lang w:val="es-ES"/>
-        </w:rPr>
-        <w:t>Configuración VM</w:t>
+        <w:pStyle w:val="Heading2"/>
+      </w:pPr>
+      <w:bookmarkStart w:id="29" w:name="_Toc175751179"/>
+      <w:r>
+        <w:t xml:space="preserve">Configuración </w:t>
+      </w:r>
+      <w:r>
+        <w:t>especial necesarias para ejecutar el Bot</w:t>
+      </w:r>
+      <w:r>
+        <w:t xml:space="preserve"> (solo en caso de ser necesario)</w:t>
       </w:r>
       <w:bookmarkEnd w:id="29"/>
-    </w:p>
-    <w:p>
-      <w:pPr>
-        <w:rPr>
-          <w:lang w:val="es-ES" w:eastAsia="en-US"/>
-        </w:rPr>
-      </w:pPr>
-      <w:r>
-        <w:rPr>
-          <w:lang w:val="es-ES" w:eastAsia="en-US"/>
-        </w:rPr>
-        <w:t xml:space="preserve">Las VM </w:t>
-      </w:r>
-      <w:r>
-        <w:rPr>
-          <w:lang w:val="es-ES" w:eastAsia="en-US"/>
-        </w:rPr>
-        <w:t>deberá</w:t>
-      </w:r>
-      <w:r>
-        <w:rPr>
-          <w:lang w:val="es-ES" w:eastAsia="en-US"/>
-        </w:rPr>
-        <w:t>n tener</w:t>
-      </w:r>
-      <w:r>
-        <w:rPr>
-          <w:lang w:val="es-ES" w:eastAsia="en-US"/>
-        </w:rPr>
-        <w:t xml:space="preserve"> configurado</w:t>
-      </w:r>
-      <w:r>
-        <w:rPr>
-          <w:lang w:val="es-ES" w:eastAsia="en-US"/>
-        </w:rPr>
-        <w:t xml:space="preserve"> por regla general </w:t>
-      </w:r>
-      <w:r>
-        <w:rPr>
-          <w:lang w:val="es-ES" w:eastAsia="en-US"/>
-        </w:rPr>
-        <w:t>“</w:t>
-      </w:r>
-      <w:r>
-        <w:rPr>
-          <w:lang w:val="es-ES" w:eastAsia="en-US"/>
-        </w:rPr>
-        <w:t>estándar configuración</w:t>
-      </w:r>
-      <w:r>
-        <w:rPr>
-          <w:lang w:val="es-ES" w:eastAsia="en-US"/>
-        </w:rPr>
-        <w:t xml:space="preserve"> </w:t>
-      </w:r>
-      <w:r>
-        <w:rPr>
-          <w:lang w:val="es-ES" w:eastAsia="en-US"/>
-        </w:rPr>
-        <w:t>VM en cada ambiente (</w:t>
-      </w:r>
-      <w:r>
-        <w:rPr>
-          <w:highlight w:val="yellow"/>
-          <w:lang w:val="es-ES" w:eastAsia="en-US"/>
-        </w:rPr>
-        <w:t>pegar link hipervínculo</w:t>
-      </w:r>
-      <w:r>
-        <w:rPr>
-          <w:lang w:val="es-ES" w:eastAsia="en-US"/>
-        </w:rPr>
-        <w:t>)”</w:t>
-      </w:r>
-    </w:p>
-    <w:p>
-      <w:pPr>
-        <w:pStyle w:val="Heading2"/>
-      </w:pPr>
-      <w:bookmarkStart w:id="30" w:name="_Toc175751179"/>
-      <w:r>
-        <w:t xml:space="preserve">Configuración </w:t>
-      </w:r>
-      <w:r>
-        <w:t>especial necesarias para ejecutar el Bot</w:t>
-      </w:r>
-      <w:r>
-        <w:t xml:space="preserve"> (solo en caso de ser necesario)</w:t>
-      </w:r>
-      <w:bookmarkEnd w:id="30"/>
     </w:p>
     <w:p>
       <w:pPr>
@@ -9242,7 +8671,7 @@
           <w:lang w:val="es-ES"/>
         </w:rPr>
       </w:pPr>
-      <w:bookmarkStart w:id="31" w:name="_Toc175751180"/>
+      <w:bookmarkStart w:id="30" w:name="_Toc175751180"/>
       <w:r>
         <w:rPr>
           <w:rFonts w:cs="Segoe UI"/>
@@ -9261,7 +8690,7 @@
         </w:rPr>
         <w:t>Código en Python</w:t>
       </w:r>
-      <w:bookmarkEnd w:id="31"/>
+      <w:bookmarkEnd w:id="30"/>
     </w:p>
     <w:p>
       <w:pPr>
@@ -9474,7 +8903,7 @@
           <w:lang w:val="es-ES"/>
         </w:rPr>
       </w:pPr>
-      <w:bookmarkStart w:id="32" w:name="_Toc175751181"/>
+      <w:bookmarkStart w:id="31" w:name="_Toc175751181"/>
       <w:r>
         <w:rPr>
           <w:rFonts w:cs="Segoe UI"/>
@@ -9493,7 +8922,7 @@
         </w:rPr>
         <w:t>API del Sistema</w:t>
       </w:r>
-      <w:bookmarkEnd w:id="32"/>
+      <w:bookmarkEnd w:id="31"/>
     </w:p>
     <w:p>
       <w:pPr>
@@ -9710,7 +9139,7 @@
           <w:lang w:val="es-ES"/>
         </w:rPr>
       </w:pPr>
-      <w:bookmarkStart w:id="33" w:name="_Toc175751182"/>
+      <w:bookmarkStart w:id="32" w:name="_Toc175751182"/>
       <w:r>
         <w:rPr>
           <w:rFonts w:cs="Segoe UI"/>
@@ -9745,7 +9174,7 @@
         </w:rPr>
         <w:t xml:space="preserve"> del Área</w:t>
       </w:r>
-      <w:bookmarkEnd w:id="33"/>
+      <w:bookmarkEnd w:id="32"/>
     </w:p>
     <w:p>
       <w:pPr>
@@ -9957,7 +9386,7 @@
           <w:lang w:val="es-ES"/>
         </w:rPr>
       </w:pPr>
-      <w:bookmarkStart w:id="34" w:name="_Toc175751183"/>
+      <w:bookmarkStart w:id="33" w:name="_Toc175751183"/>
       <w:r>
         <w:rPr>
           <w:rFonts w:cs="Segoe UI"/>
@@ -9992,7 +9421,7 @@
         </w:rPr>
         <w:t>Bot</w:t>
       </w:r>
-      <w:bookmarkEnd w:id="34"/>
+      <w:bookmarkEnd w:id="33"/>
     </w:p>
     <w:p>
       <w:pPr>
@@ -10076,7 +9505,7 @@
         <w:lastRenderedPageBreak/>
         <w:t xml:space="preserve"> </w:t>
       </w:r>
-      <w:bookmarkStart w:id="35" w:name="_Toc175751184"/>
+      <w:bookmarkStart w:id="34" w:name="_Toc175751184"/>
       <w:r>
         <w:rPr>
           <w:rFonts w:cs="Segoe UI"/>
@@ -10093,7 +9522,7 @@
         </w:rPr>
         <w:t>Renovación de credenciales</w:t>
       </w:r>
-      <w:bookmarkEnd w:id="35"/>
+      <w:bookmarkEnd w:id="34"/>
       <w:r>
         <w:rPr>
           <w:rFonts w:cs="Segoe UI"/>
@@ -10122,56 +9551,26 @@
           <w:lang w:val="es-ES" w:eastAsia="en-US"/>
         </w:rPr>
       </w:pPr>
-      <w:proofErr w:type="gramStart"/>
       <w:r>
         <w:rPr>
           <w:lang w:val="es-ES" w:eastAsia="en-US"/>
         </w:rPr>
-        <w:t>Caducan?</w:t>
-      </w:r>
-      <w:proofErr w:type="gramEnd"/>
+        <w:t xml:space="preserve">Caducan? Cada </w:t>
+      </w:r>
+      <w:proofErr w:type="spellStart"/>
       <w:r>
         <w:rPr>
           <w:lang w:val="es-ES" w:eastAsia="en-US"/>
         </w:rPr>
-        <w:t xml:space="preserve"> </w:t>
-      </w:r>
-      <w:proofErr w:type="gramStart"/>
+        <w:t>cuanto</w:t>
+      </w:r>
+      <w:proofErr w:type="spellEnd"/>
       <w:r>
         <w:rPr>
           <w:lang w:val="es-ES" w:eastAsia="en-US"/>
         </w:rPr>
-        <w:t xml:space="preserve">Cada </w:t>
-      </w:r>
-      <w:proofErr w:type="spellStart"/>
-      <w:r>
-        <w:rPr>
-          <w:lang w:val="es-ES" w:eastAsia="en-US"/>
-        </w:rPr>
-        <w:t>cuanto</w:t>
-      </w:r>
-      <w:proofErr w:type="spellEnd"/>
-      <w:r>
-        <w:rPr>
-          <w:lang w:val="es-ES" w:eastAsia="en-US"/>
-        </w:rPr>
-        <w:t>?</w:t>
-      </w:r>
-      <w:proofErr w:type="gramEnd"/>
-      <w:r>
-        <w:rPr>
-          <w:lang w:val="es-ES" w:eastAsia="en-US"/>
-        </w:rPr>
-        <w:t xml:space="preserve"> </w:t>
-      </w:r>
-      <w:proofErr w:type="gramStart"/>
-      <w:r>
-        <w:rPr>
-          <w:lang w:val="es-ES" w:eastAsia="en-US"/>
-        </w:rPr>
-        <w:t>Quien es el encargado de renovarlas?</w:t>
-      </w:r>
-      <w:proofErr w:type="gramEnd"/>
+        <w:t>? Quien es el encargado de renovarlas?</w:t>
+      </w:r>
     </w:p>
     <w:p>
       <w:pPr>
@@ -10241,7 +9640,7 @@
         <w:lastRenderedPageBreak/>
         <w:t xml:space="preserve"> </w:t>
       </w:r>
-      <w:bookmarkStart w:id="36" w:name="_Toc175751185"/>
+      <w:bookmarkStart w:id="35" w:name="_Toc175751185"/>
       <w:r>
         <w:rPr>
           <w:rFonts w:cs="Segoe UI"/>
@@ -10258,7 +9657,7 @@
         </w:rPr>
         <w:t>Certificados a portales</w:t>
       </w:r>
-      <w:bookmarkEnd w:id="36"/>
+      <w:bookmarkEnd w:id="35"/>
       <w:r>
         <w:rPr>
           <w:rFonts w:cs="Segoe UI"/>
@@ -10396,7 +9795,7 @@
         <w:lastRenderedPageBreak/>
         <w:t xml:space="preserve"> </w:t>
       </w:r>
-      <w:bookmarkStart w:id="37" w:name="_Toc175751186"/>
+      <w:bookmarkStart w:id="36" w:name="_Toc175751186"/>
       <w:r>
         <w:rPr>
           <w:rFonts w:cs="Segoe UI"/>
@@ -10412,59 +9811,147 @@
           <w:lang w:val="es-ES"/>
         </w:rPr>
         <w:t>Apertura puertos a portales</w:t>
+      </w:r>
+      <w:bookmarkEnd w:id="36"/>
+    </w:p>
+    <w:p>
+      <w:pPr>
+        <w:spacing w:before="0" w:after="160" w:line="259" w:lineRule="auto"/>
+        <w:jc w:val="left"/>
+        <w:rPr>
+          <w:lang w:val="es-ES" w:eastAsia="en-US"/>
+        </w:rPr>
+      </w:pPr>
+      <w:r>
+        <w:rPr>
+          <w:lang w:val="es-ES" w:eastAsia="en-US"/>
+        </w:rPr>
+        <w:t xml:space="preserve">En caso </w:t>
+      </w:r>
+      <w:r>
+        <w:rPr>
+          <w:lang w:val="es-ES" w:eastAsia="en-US"/>
+        </w:rPr>
+        <w:t xml:space="preserve">de que la VM necesite la apertura de puertos internos para ingresar al portal </w:t>
+      </w:r>
+      <w:r>
+        <w:rPr>
+          <w:lang w:val="es-ES" w:eastAsia="en-US"/>
+        </w:rPr>
+        <w:t xml:space="preserve">mencionarlo en este punto. </w:t>
+      </w:r>
+      <w:r>
+        <w:rPr>
+          <w:lang w:val="es-ES" w:eastAsia="en-US"/>
+        </w:rPr>
+        <w:t>Ej.</w:t>
+      </w:r>
+      <w:r>
+        <w:rPr>
+          <w:lang w:val="es-ES" w:eastAsia="en-US"/>
+        </w:rPr>
+        <w:t xml:space="preserve"> Prod002</w:t>
+      </w:r>
+    </w:p>
+    <w:p>
+      <w:pPr>
+        <w:spacing w:before="0" w:after="160" w:line="259" w:lineRule="auto"/>
+        <w:jc w:val="left"/>
+        <w:rPr>
+          <w:lang w:val="es-ES" w:eastAsia="en-US"/>
+        </w:rPr>
+      </w:pPr>
+      <w:r>
+        <w:rPr>
+          <w:lang w:val="es-ES" w:eastAsia="en-US"/>
+        </w:rPr>
+        <w:br w:type="page"/>
+      </w:r>
+    </w:p>
+    <w:p>
+      <w:pPr>
+        <w:pStyle w:val="Heading1"/>
+        <w:shd w:val="clear" w:color="auto" w:fill="auto"/>
+        <w:ind w:left="426"/>
+        <w:rPr>
+          <w:rFonts w:cs="Segoe UI"/>
+          <w:smallCaps w:val="0"/>
+          <w:color w:val="E37800"/>
+          <w:lang w:val="es-ES"/>
+        </w:rPr>
+      </w:pPr>
+      <w:r>
+        <w:rPr>
+          <w:rFonts w:cs="Segoe UI"/>
+          <w:color w:val="E37800"/>
+          <w:lang w:val="es-ES"/>
+        </w:rPr>
+        <w:lastRenderedPageBreak/>
+        <w:t xml:space="preserve"> </w:t>
+      </w:r>
+      <w:bookmarkStart w:id="37" w:name="_Toc175751187"/>
+      <w:r>
+        <w:rPr>
+          <w:rFonts w:cs="Segoe UI"/>
+          <w:color w:val="E37800"/>
+          <w:lang w:val="es-ES"/>
+        </w:rPr>
+        <w:t xml:space="preserve">| </w:t>
+      </w:r>
+      <w:r>
+        <w:rPr>
+          <w:rFonts w:cs="Segoe UI"/>
+          <w:color w:val="E37800"/>
+          <w:lang w:val="es-ES"/>
+        </w:rPr>
+        <w:t>Configuraciones de firewall</w:t>
       </w:r>
       <w:bookmarkEnd w:id="37"/>
     </w:p>
     <w:p>
       <w:pPr>
+        <w:rPr>
+          <w:lang w:val="es-ES" w:eastAsia="en-US"/>
+        </w:rPr>
+      </w:pPr>
+      <w:r>
+        <w:rPr>
+          <w:lang w:val="es-ES" w:eastAsia="en-US"/>
+        </w:rPr>
+        <w:t xml:space="preserve">En caso de que la VM </w:t>
+      </w:r>
+      <w:r>
+        <w:rPr>
+          <w:lang w:val="es-ES" w:eastAsia="en-US"/>
+        </w:rPr>
+        <w:t>necesite una condición especial respecto al firewall especificarlo en este punto</w:t>
+      </w:r>
+    </w:p>
+    <w:p>
+      <w:pPr>
+        <w:rPr>
+          <w:lang w:val="es-ES" w:eastAsia="en-US"/>
+        </w:rPr>
+      </w:pPr>
+    </w:p>
+    <w:p>
+      <w:pPr>
+        <w:rPr>
+          <w:lang w:val="es-ES"/>
+        </w:rPr>
+      </w:pPr>
+    </w:p>
+    <w:p>
+      <w:pPr>
         <w:spacing w:before="0" w:after="160" w:line="259" w:lineRule="auto"/>
         <w:jc w:val="left"/>
         <w:rPr>
-          <w:lang w:val="es-ES" w:eastAsia="en-US"/>
-        </w:rPr>
-      </w:pPr>
-      <w:r>
-        <w:rPr>
-          <w:lang w:val="es-ES" w:eastAsia="en-US"/>
-        </w:rPr>
-        <w:t xml:space="preserve">En caso </w:t>
-      </w:r>
-      <w:r>
-        <w:rPr>
-          <w:lang w:val="es-ES" w:eastAsia="en-US"/>
-        </w:rPr>
-        <w:t xml:space="preserve">de que la VM necesite la apertura de puertos internos para ingresar al portal </w:t>
-      </w:r>
-      <w:r>
-        <w:rPr>
-          <w:lang w:val="es-ES" w:eastAsia="en-US"/>
-        </w:rPr>
-        <w:t xml:space="preserve">mencionarlo en este punto. </w:t>
-      </w:r>
-      <w:r>
-        <w:rPr>
-          <w:lang w:val="es-ES" w:eastAsia="en-US"/>
-        </w:rPr>
-        <w:t>Ej.</w:t>
-      </w:r>
-      <w:r>
-        <w:rPr>
-          <w:lang w:val="es-ES" w:eastAsia="en-US"/>
-        </w:rPr>
-        <w:t xml:space="preserve"> Prod002</w:t>
-      </w:r>
-    </w:p>
-    <w:p>
-      <w:pPr>
-        <w:spacing w:before="0" w:after="160" w:line="259" w:lineRule="auto"/>
-        <w:jc w:val="left"/>
-        <w:rPr>
-          <w:lang w:val="es-ES" w:eastAsia="en-US"/>
-        </w:rPr>
-      </w:pPr>
-      <w:r>
-        <w:rPr>
-          <w:lang w:val="es-ES" w:eastAsia="en-US"/>
+          <w:lang w:val="es-ES"/>
+        </w:rPr>
+      </w:pPr>
+      <w:r>
+        <w:rPr>
+          <w:lang w:val="es-ES"/>
         </w:rPr>
         <w:br w:type="page"/>
       </w:r>
@@ -10481,102 +9968,14 @@
           <w:lang w:val="es-ES"/>
         </w:rPr>
       </w:pPr>
-      <w:r>
-        <w:rPr>
-          <w:rFonts w:cs="Segoe UI"/>
-          <w:color w:val="E37800"/>
-          <w:lang w:val="es-ES"/>
-        </w:rPr>
-        <w:lastRenderedPageBreak/>
-        <w:t xml:space="preserve"> </w:t>
-      </w:r>
-      <w:bookmarkStart w:id="38" w:name="_Toc175751187"/>
-      <w:r>
-        <w:rPr>
-          <w:rFonts w:cs="Segoe UI"/>
-          <w:color w:val="E37800"/>
-          <w:lang w:val="es-ES"/>
-        </w:rPr>
-        <w:t xml:space="preserve">| </w:t>
-      </w:r>
-      <w:r>
-        <w:rPr>
-          <w:rFonts w:cs="Segoe UI"/>
-          <w:color w:val="E37800"/>
-          <w:lang w:val="es-ES"/>
-        </w:rPr>
-        <w:t>Configuraciones de firewall</w:t>
-      </w:r>
-      <w:bookmarkEnd w:id="38"/>
-    </w:p>
-    <w:p>
-      <w:pPr>
-        <w:rPr>
-          <w:lang w:val="es-ES" w:eastAsia="en-US"/>
-        </w:rPr>
-      </w:pPr>
-      <w:r>
-        <w:rPr>
-          <w:lang w:val="es-ES" w:eastAsia="en-US"/>
-        </w:rPr>
-        <w:t xml:space="preserve">En caso de que la VM </w:t>
-      </w:r>
-      <w:r>
-        <w:rPr>
-          <w:lang w:val="es-ES" w:eastAsia="en-US"/>
-        </w:rPr>
-        <w:t>necesite una condición especial respecto al firewall especificarlo en este punto</w:t>
-      </w:r>
-    </w:p>
-    <w:p>
-      <w:pPr>
-        <w:rPr>
-          <w:lang w:val="es-ES" w:eastAsia="en-US"/>
-        </w:rPr>
-      </w:pPr>
-    </w:p>
-    <w:p>
-      <w:pPr>
-        <w:rPr>
-          <w:lang w:val="es-ES"/>
-        </w:rPr>
-      </w:pPr>
-    </w:p>
-    <w:p>
-      <w:pPr>
-        <w:spacing w:before="0" w:after="160" w:line="259" w:lineRule="auto"/>
-        <w:jc w:val="left"/>
-        <w:rPr>
-          <w:lang w:val="es-ES"/>
-        </w:rPr>
-      </w:pPr>
-      <w:r>
-        <w:rPr>
-          <w:lang w:val="es-ES"/>
-        </w:rPr>
-        <w:br w:type="page"/>
-      </w:r>
-    </w:p>
-    <w:p>
-      <w:pPr>
-        <w:pStyle w:val="Heading1"/>
-        <w:shd w:val="clear" w:color="auto" w:fill="auto"/>
-        <w:ind w:left="426"/>
+      <w:bookmarkStart w:id="38" w:name="_Toc175751188"/>
+      <w:r>
         <w:rPr>
           <w:rFonts w:cs="Segoe UI"/>
           <w:smallCaps w:val="0"/>
           <w:color w:val="E37800"/>
           <w:lang w:val="es-ES"/>
         </w:rPr>
-      </w:pPr>
-      <w:bookmarkStart w:id="39" w:name="_Toc175751188"/>
-      <w:r>
-        <w:rPr>
-          <w:rFonts w:cs="Segoe UI"/>
-          <w:smallCaps w:val="0"/>
-          <w:color w:val="E37800"/>
-          <w:lang w:val="es-ES"/>
-        </w:rPr>
         <w:lastRenderedPageBreak/>
         <w:t xml:space="preserve">| </w:t>
       </w:r>
@@ -10588,7 +9987,7 @@
         </w:rPr>
         <w:t>Complementos WEB</w:t>
       </w:r>
-      <w:bookmarkEnd w:id="39"/>
+      <w:bookmarkEnd w:id="38"/>
     </w:p>
     <w:p>
       <w:pPr>
@@ -10700,7 +10099,7 @@
           <w:lang w:val="es-ES"/>
         </w:rPr>
       </w:pPr>
-      <w:bookmarkStart w:id="40" w:name="_Toc175751189"/>
+      <w:bookmarkStart w:id="39" w:name="_Toc175751189"/>
       <w:r>
         <w:rPr>
           <w:rFonts w:cs="Segoe UI"/>
@@ -10720,7 +10119,7 @@
         </w:rPr>
         <w:t>Metabots</w:t>
       </w:r>
-      <w:bookmarkEnd w:id="40"/>
+      <w:bookmarkEnd w:id="39"/>
       <w:proofErr w:type="spellEnd"/>
     </w:p>
     <w:p>
@@ -10864,7 +10263,7 @@
           <w:lang w:val="es-ES"/>
         </w:rPr>
       </w:pPr>
-      <w:bookmarkStart w:id="41" w:name="_Toc175751190"/>
+      <w:bookmarkStart w:id="40" w:name="_Toc175751190"/>
       <w:r>
         <w:rPr>
           <w:rFonts w:cs="Segoe UI"/>
@@ -10883,7 +10282,7 @@
         </w:rPr>
         <w:t>OCR (Lectura documentos)</w:t>
       </w:r>
-      <w:bookmarkEnd w:id="41"/>
+      <w:bookmarkEnd w:id="40"/>
     </w:p>
     <w:p>
       <w:pPr>
@@ -11052,7 +10451,7 @@
           <w:lang w:val="es-ES"/>
         </w:rPr>
       </w:pPr>
-      <w:bookmarkStart w:id="42" w:name="_Toc175751191"/>
+      <w:bookmarkStart w:id="41" w:name="_Toc175751191"/>
       <w:r>
         <w:rPr>
           <w:rFonts w:cs="Segoe UI"/>
@@ -11090,7 +10489,7 @@
         </w:rPr>
         <w:t>interno</w:t>
       </w:r>
-      <w:bookmarkEnd w:id="42"/>
+      <w:bookmarkEnd w:id="41"/>
     </w:p>
     <w:tbl>
       <w:tblPr>
@@ -14727,6 +14126,119 @@
     </w:lvl>
   </w:abstractNum>
   <w:abstractNum w:abstractNumId="20" w15:restartNumberingAfterBreak="0">
+    <w:nsid w:val="39EC580F"/>
+    <w:multiLevelType w:val="multilevel"/>
+    <w:tmpl w:val="13CCCEA0"/>
+    <w:lvl w:ilvl="0">
+      <w:start w:val="1"/>
+      <w:numFmt w:val="decimal"/>
+      <w:lvlText w:val="%1."/>
+      <w:lvlJc w:val="left"/>
+      <w:pPr>
+        <w:tabs>
+          <w:tab w:val="num" w:pos="720"/>
+        </w:tabs>
+        <w:ind w:left="720" w:hanging="360"/>
+      </w:pPr>
+    </w:lvl>
+    <w:lvl w:ilvl="1">
+      <w:start w:val="1"/>
+      <w:numFmt w:val="decimal"/>
+      <w:lvlText w:val="%2."/>
+      <w:lvlJc w:val="left"/>
+      <w:pPr>
+        <w:ind w:left="1440" w:hanging="360"/>
+      </w:pPr>
+      <w:rPr>
+        <w:rFonts w:hint="default"/>
+      </w:rPr>
+    </w:lvl>
+    <w:lvl w:ilvl="2" w:tentative="1">
+      <w:start w:val="1"/>
+      <w:numFmt w:val="decimal"/>
+      <w:lvlText w:val="%3."/>
+      <w:lvlJc w:val="left"/>
+      <w:pPr>
+        <w:tabs>
+          <w:tab w:val="num" w:pos="2160"/>
+        </w:tabs>
+        <w:ind w:left="2160" w:hanging="360"/>
+      </w:pPr>
+    </w:lvl>
+    <w:lvl w:ilvl="3" w:tentative="1">
+      <w:start w:val="1"/>
+      <w:numFmt w:val="decimal"/>
+      <w:lvlText w:val="%4."/>
+      <w:lvlJc w:val="left"/>
+      <w:pPr>
+        <w:tabs>
+          <w:tab w:val="num" w:pos="2880"/>
+        </w:tabs>
+        <w:ind w:left="2880" w:hanging="360"/>
+      </w:pPr>
+    </w:lvl>
+    <w:lvl w:ilvl="4" w:tentative="1">
+      <w:start w:val="1"/>
+      <w:numFmt w:val="decimal"/>
+      <w:lvlText w:val="%5."/>
+      <w:lvlJc w:val="left"/>
+      <w:pPr>
+        <w:tabs>
+          <w:tab w:val="num" w:pos="3600"/>
+        </w:tabs>
+        <w:ind w:left="3600" w:hanging="360"/>
+      </w:pPr>
+    </w:lvl>
+    <w:lvl w:ilvl="5" w:tentative="1">
+      <w:start w:val="1"/>
+      <w:numFmt w:val="decimal"/>
+      <w:lvlText w:val="%6."/>
+      <w:lvlJc w:val="left"/>
+      <w:pPr>
+        <w:tabs>
+          <w:tab w:val="num" w:pos="4320"/>
+        </w:tabs>
+        <w:ind w:left="4320" w:hanging="360"/>
+      </w:pPr>
+    </w:lvl>
+    <w:lvl w:ilvl="6" w:tentative="1">
+      <w:start w:val="1"/>
+      <w:numFmt w:val="decimal"/>
+      <w:lvlText w:val="%7."/>
+      <w:lvlJc w:val="left"/>
+      <w:pPr>
+        <w:tabs>
+          <w:tab w:val="num" w:pos="5040"/>
+        </w:tabs>
+        <w:ind w:left="5040" w:hanging="360"/>
+      </w:pPr>
+    </w:lvl>
+    <w:lvl w:ilvl="7" w:tentative="1">
+      <w:start w:val="1"/>
+      <w:numFmt w:val="decimal"/>
+      <w:lvlText w:val="%8."/>
+      <w:lvlJc w:val="left"/>
+      <w:pPr>
+        <w:tabs>
+          <w:tab w:val="num" w:pos="5760"/>
+        </w:tabs>
+        <w:ind w:left="5760" w:hanging="360"/>
+      </w:pPr>
+    </w:lvl>
+    <w:lvl w:ilvl="8" w:tentative="1">
+      <w:start w:val="1"/>
+      <w:numFmt w:val="decimal"/>
+      <w:lvlText w:val="%9."/>
+      <w:lvlJc w:val="left"/>
+      <w:pPr>
+        <w:tabs>
+          <w:tab w:val="num" w:pos="6480"/>
+        </w:tabs>
+        <w:ind w:left="6480" w:hanging="360"/>
+      </w:pPr>
+    </w:lvl>
+  </w:abstractNum>
+  <w:abstractNum w:abstractNumId="21" w15:restartNumberingAfterBreak="0">
     <w:nsid w:val="3D6A56E2"/>
     <w:multiLevelType w:val="hybridMultilevel"/>
     <w:tmpl w:val="63AC3042"/>
@@ -14840,7 +14352,7 @@
       </w:rPr>
     </w:lvl>
   </w:abstractNum>
-  <w:abstractNum w:abstractNumId="21" w15:restartNumberingAfterBreak="0">
+  <w:abstractNum w:abstractNumId="22" w15:restartNumberingAfterBreak="0">
     <w:nsid w:val="3E73120B"/>
     <w:multiLevelType w:val="hybridMultilevel"/>
     <w:tmpl w:val="D1D43B8C"/>
@@ -14929,7 +14441,7 @@
       </w:pPr>
     </w:lvl>
   </w:abstractNum>
-  <w:abstractNum w:abstractNumId="22" w15:restartNumberingAfterBreak="0">
+  <w:abstractNum w:abstractNumId="23" w15:restartNumberingAfterBreak="0">
     <w:nsid w:val="423D51F8"/>
     <w:multiLevelType w:val="hybridMultilevel"/>
     <w:tmpl w:val="6102ED28"/>
@@ -15044,7 +14556,7 @@
       </w:rPr>
     </w:lvl>
   </w:abstractNum>
-  <w:abstractNum w:abstractNumId="23" w15:restartNumberingAfterBreak="0">
+  <w:abstractNum w:abstractNumId="24" w15:restartNumberingAfterBreak="0">
     <w:nsid w:val="437944A1"/>
     <w:multiLevelType w:val="hybridMultilevel"/>
     <w:tmpl w:val="3C18C586"/>
@@ -15157,7 +14669,7 @@
       </w:rPr>
     </w:lvl>
   </w:abstractNum>
-  <w:abstractNum w:abstractNumId="24" w15:restartNumberingAfterBreak="0">
+  <w:abstractNum w:abstractNumId="25" w15:restartNumberingAfterBreak="0">
     <w:nsid w:val="45B31888"/>
     <w:multiLevelType w:val="hybridMultilevel"/>
     <w:tmpl w:val="A794649C"/>
@@ -15246,7 +14758,7 @@
       </w:pPr>
     </w:lvl>
   </w:abstractNum>
-  <w:abstractNum w:abstractNumId="25" w15:restartNumberingAfterBreak="0">
+  <w:abstractNum w:abstractNumId="26" w15:restartNumberingAfterBreak="0">
     <w:nsid w:val="48D95F30"/>
     <w:multiLevelType w:val="hybridMultilevel"/>
     <w:tmpl w:val="7F0A0834"/>
@@ -15360,7 +14872,7 @@
       </w:rPr>
     </w:lvl>
   </w:abstractNum>
-  <w:abstractNum w:abstractNumId="26" w15:restartNumberingAfterBreak="0">
+  <w:abstractNum w:abstractNumId="27" w15:restartNumberingAfterBreak="0">
     <w:nsid w:val="4CD130A1"/>
     <w:multiLevelType w:val="hybridMultilevel"/>
     <w:tmpl w:val="90CC63D8"/>
@@ -15473,7 +14985,7 @@
       </w:rPr>
     </w:lvl>
   </w:abstractNum>
-  <w:abstractNum w:abstractNumId="27" w15:restartNumberingAfterBreak="0">
+  <w:abstractNum w:abstractNumId="28" w15:restartNumberingAfterBreak="0">
     <w:nsid w:val="5006450B"/>
     <w:multiLevelType w:val="hybridMultilevel"/>
     <w:tmpl w:val="D9E8298E"/>
@@ -15586,7 +15098,7 @@
       </w:rPr>
     </w:lvl>
   </w:abstractNum>
-  <w:abstractNum w:abstractNumId="28" w15:restartNumberingAfterBreak="0">
+  <w:abstractNum w:abstractNumId="29" w15:restartNumberingAfterBreak="0">
     <w:nsid w:val="50DE1E6A"/>
     <w:multiLevelType w:val="hybridMultilevel"/>
     <w:tmpl w:val="DE2027A0"/>
@@ -15675,7 +15187,7 @@
       </w:pPr>
     </w:lvl>
   </w:abstractNum>
-  <w:abstractNum w:abstractNumId="29" w15:restartNumberingAfterBreak="0">
+  <w:abstractNum w:abstractNumId="30" w15:restartNumberingAfterBreak="0">
     <w:nsid w:val="51E75DEB"/>
     <w:multiLevelType w:val="hybridMultilevel"/>
     <w:tmpl w:val="FFFFFFFF"/>
@@ -15761,7 +15273,7 @@
       </w:pPr>
     </w:lvl>
   </w:abstractNum>
-  <w:abstractNum w:abstractNumId="30" w15:restartNumberingAfterBreak="0">
+  <w:abstractNum w:abstractNumId="31" w15:restartNumberingAfterBreak="0">
     <w:nsid w:val="53EE204D"/>
     <w:multiLevelType w:val="hybridMultilevel"/>
     <w:tmpl w:val="652CE610"/>
@@ -15905,7 +15417,7 @@
       </w:rPr>
     </w:lvl>
   </w:abstractNum>
-  <w:abstractNum w:abstractNumId="31" w15:restartNumberingAfterBreak="0">
+  <w:abstractNum w:abstractNumId="32" w15:restartNumberingAfterBreak="0">
     <w:nsid w:val="54602BAE"/>
     <w:multiLevelType w:val="hybridMultilevel"/>
     <w:tmpl w:val="ECD677FC"/>
@@ -16017,7 +15529,7 @@
       </w:rPr>
     </w:lvl>
   </w:abstractNum>
-  <w:abstractNum w:abstractNumId="32" w15:restartNumberingAfterBreak="0">
+  <w:abstractNum w:abstractNumId="33" w15:restartNumberingAfterBreak="0">
     <w:nsid w:val="55FE452C"/>
     <w:multiLevelType w:val="hybridMultilevel"/>
     <w:tmpl w:val="C5748532"/>
@@ -16106,7 +15618,120 @@
       </w:pPr>
     </w:lvl>
   </w:abstractNum>
-  <w:abstractNum w:abstractNumId="33" w15:restartNumberingAfterBreak="0">
+  <w:abstractNum w:abstractNumId="34" w15:restartNumberingAfterBreak="0">
+    <w:nsid w:val="5868688E"/>
+    <w:multiLevelType w:val="multilevel"/>
+    <w:tmpl w:val="E9C4BE38"/>
+    <w:lvl w:ilvl="0">
+      <w:start w:val="1"/>
+      <w:numFmt w:val="decimal"/>
+      <w:lvlText w:val="%1."/>
+      <w:lvlJc w:val="left"/>
+      <w:pPr>
+        <w:tabs>
+          <w:tab w:val="num" w:pos="720"/>
+        </w:tabs>
+        <w:ind w:left="720" w:hanging="360"/>
+      </w:pPr>
+    </w:lvl>
+    <w:lvl w:ilvl="1" w:tentative="1">
+      <w:start w:val="1"/>
+      <w:numFmt w:val="decimal"/>
+      <w:lvlText w:val="%2."/>
+      <w:lvlJc w:val="left"/>
+      <w:pPr>
+        <w:tabs>
+          <w:tab w:val="num" w:pos="1440"/>
+        </w:tabs>
+        <w:ind w:left="1440" w:hanging="360"/>
+      </w:pPr>
+    </w:lvl>
+    <w:lvl w:ilvl="2" w:tentative="1">
+      <w:start w:val="1"/>
+      <w:numFmt w:val="decimal"/>
+      <w:lvlText w:val="%3."/>
+      <w:lvlJc w:val="left"/>
+      <w:pPr>
+        <w:tabs>
+          <w:tab w:val="num" w:pos="2160"/>
+        </w:tabs>
+        <w:ind w:left="2160" w:hanging="360"/>
+      </w:pPr>
+    </w:lvl>
+    <w:lvl w:ilvl="3" w:tentative="1">
+      <w:start w:val="1"/>
+      <w:numFmt w:val="decimal"/>
+      <w:lvlText w:val="%4."/>
+      <w:lvlJc w:val="left"/>
+      <w:pPr>
+        <w:tabs>
+          <w:tab w:val="num" w:pos="2880"/>
+        </w:tabs>
+        <w:ind w:left="2880" w:hanging="360"/>
+      </w:pPr>
+    </w:lvl>
+    <w:lvl w:ilvl="4" w:tentative="1">
+      <w:start w:val="1"/>
+      <w:numFmt w:val="decimal"/>
+      <w:lvlText w:val="%5."/>
+      <w:lvlJc w:val="left"/>
+      <w:pPr>
+        <w:tabs>
+          <w:tab w:val="num" w:pos="3600"/>
+        </w:tabs>
+        <w:ind w:left="3600" w:hanging="360"/>
+      </w:pPr>
+    </w:lvl>
+    <w:lvl w:ilvl="5" w:tentative="1">
+      <w:start w:val="1"/>
+      <w:numFmt w:val="decimal"/>
+      <w:lvlText w:val="%6."/>
+      <w:lvlJc w:val="left"/>
+      <w:pPr>
+        <w:tabs>
+          <w:tab w:val="num" w:pos="4320"/>
+        </w:tabs>
+        <w:ind w:left="4320" w:hanging="360"/>
+      </w:pPr>
+    </w:lvl>
+    <w:lvl w:ilvl="6" w:tentative="1">
+      <w:start w:val="1"/>
+      <w:numFmt w:val="decimal"/>
+      <w:lvlText w:val="%7."/>
+      <w:lvlJc w:val="left"/>
+      <w:pPr>
+        <w:tabs>
+          <w:tab w:val="num" w:pos="5040"/>
+        </w:tabs>
+        <w:ind w:left="5040" w:hanging="360"/>
+      </w:pPr>
+    </w:lvl>
+    <w:lvl w:ilvl="7" w:tentative="1">
+      <w:start w:val="1"/>
+      <w:numFmt w:val="decimal"/>
+      <w:lvlText w:val="%8."/>
+      <w:lvlJc w:val="left"/>
+      <w:pPr>
+        <w:tabs>
+          <w:tab w:val="num" w:pos="5760"/>
+        </w:tabs>
+        <w:ind w:left="5760" w:hanging="360"/>
+      </w:pPr>
+    </w:lvl>
+    <w:lvl w:ilvl="8" w:tentative="1">
+      <w:start w:val="1"/>
+      <w:numFmt w:val="decimal"/>
+      <w:lvlText w:val="%9."/>
+      <w:lvlJc w:val="left"/>
+      <w:pPr>
+        <w:tabs>
+          <w:tab w:val="num" w:pos="6480"/>
+        </w:tabs>
+        <w:ind w:left="6480" w:hanging="360"/>
+      </w:pPr>
+    </w:lvl>
+  </w:abstractNum>
+  <w:abstractNum w:abstractNumId="35" w15:restartNumberingAfterBreak="0">
     <w:nsid w:val="5E680334"/>
     <w:multiLevelType w:val="multilevel"/>
     <w:tmpl w:val="273C97AA"/>
@@ -16230,7 +15855,7 @@
       </w:rPr>
     </w:lvl>
   </w:abstractNum>
-  <w:abstractNum w:abstractNumId="34" w15:restartNumberingAfterBreak="0">
+  <w:abstractNum w:abstractNumId="36" w15:restartNumberingAfterBreak="0">
     <w:nsid w:val="5F5D3D7B"/>
     <w:multiLevelType w:val="hybridMultilevel"/>
     <w:tmpl w:val="B9A21918"/>
@@ -16343,7 +15968,7 @@
       </w:rPr>
     </w:lvl>
   </w:abstractNum>
-  <w:abstractNum w:abstractNumId="35" w15:restartNumberingAfterBreak="0">
+  <w:abstractNum w:abstractNumId="37" w15:restartNumberingAfterBreak="0">
     <w:nsid w:val="62DD0BD1"/>
     <w:multiLevelType w:val="singleLevel"/>
     <w:tmpl w:val="D6D0AB50"/>
@@ -16364,7 +15989,7 @@
       </w:rPr>
     </w:lvl>
   </w:abstractNum>
-  <w:abstractNum w:abstractNumId="36" w15:restartNumberingAfterBreak="0">
+  <w:abstractNum w:abstractNumId="38" w15:restartNumberingAfterBreak="0">
     <w:nsid w:val="63BF6541"/>
     <w:multiLevelType w:val="hybridMultilevel"/>
     <w:tmpl w:val="5A444DAC"/>
@@ -16477,7 +16102,7 @@
       </w:rPr>
     </w:lvl>
   </w:abstractNum>
-  <w:abstractNum w:abstractNumId="37" w15:restartNumberingAfterBreak="0">
+  <w:abstractNum w:abstractNumId="39" w15:restartNumberingAfterBreak="0">
     <w:nsid w:val="66580555"/>
     <w:multiLevelType w:val="hybridMultilevel"/>
     <w:tmpl w:val="32CC1584"/>
@@ -16566,7 +16191,7 @@
       </w:pPr>
     </w:lvl>
   </w:abstractNum>
-  <w:abstractNum w:abstractNumId="38" w15:restartNumberingAfterBreak="0">
+  <w:abstractNum w:abstractNumId="40" w15:restartNumberingAfterBreak="0">
     <w:nsid w:val="67F56981"/>
     <w:multiLevelType w:val="hybridMultilevel"/>
     <w:tmpl w:val="96DAD6EE"/>
@@ -16679,7 +16304,7 @@
       </w:rPr>
     </w:lvl>
   </w:abstractNum>
-  <w:abstractNum w:abstractNumId="39" w15:restartNumberingAfterBreak="0">
+  <w:abstractNum w:abstractNumId="41" w15:restartNumberingAfterBreak="0">
     <w:nsid w:val="71384C0D"/>
     <w:multiLevelType w:val="hybridMultilevel"/>
     <w:tmpl w:val="C088AB42"/>
@@ -16792,7 +16417,7 @@
       </w:rPr>
     </w:lvl>
   </w:abstractNum>
-  <w:abstractNum w:abstractNumId="40" w15:restartNumberingAfterBreak="0">
+  <w:abstractNum w:abstractNumId="42" w15:restartNumberingAfterBreak="0">
     <w:nsid w:val="723235C8"/>
     <w:multiLevelType w:val="hybridMultilevel"/>
     <w:tmpl w:val="B7FE3396"/>
@@ -16881,7 +16506,7 @@
       </w:pPr>
     </w:lvl>
   </w:abstractNum>
-  <w:abstractNum w:abstractNumId="41" w15:restartNumberingAfterBreak="0">
+  <w:abstractNum w:abstractNumId="43" w15:restartNumberingAfterBreak="0">
     <w:nsid w:val="735F48DB"/>
     <w:multiLevelType w:val="hybridMultilevel"/>
     <w:tmpl w:val="80501A8E"/>
@@ -16995,22 +16620,22 @@
     </w:lvl>
   </w:abstractNum>
   <w:num w:numId="1" w16cid:durableId="327680309">
-    <w:abstractNumId w:val="33"/>
+    <w:abstractNumId w:val="35"/>
   </w:num>
   <w:num w:numId="2" w16cid:durableId="1617519295">
-    <w:abstractNumId w:val="40"/>
+    <w:abstractNumId w:val="42"/>
   </w:num>
   <w:num w:numId="3" w16cid:durableId="1490823623">
-    <w:abstractNumId w:val="33"/>
+    <w:abstractNumId w:val="35"/>
   </w:num>
   <w:num w:numId="4" w16cid:durableId="829833325">
-    <w:abstractNumId w:val="33"/>
+    <w:abstractNumId w:val="35"/>
   </w:num>
   <w:num w:numId="5" w16cid:durableId="1294093388">
-    <w:abstractNumId w:val="23"/>
+    <w:abstractNumId w:val="24"/>
   </w:num>
   <w:num w:numId="6" w16cid:durableId="437985492">
-    <w:abstractNumId w:val="33"/>
+    <w:abstractNumId w:val="35"/>
     <w:lvlOverride w:ilvl="0">
       <w:startOverride w:val="1"/>
     </w:lvlOverride>
@@ -17052,31 +16677,31 @@
     <w:abstractNumId w:val="7"/>
   </w:num>
   <w:num w:numId="11" w16cid:durableId="1811436159">
-    <w:abstractNumId w:val="36"/>
+    <w:abstractNumId w:val="38"/>
   </w:num>
   <w:num w:numId="12" w16cid:durableId="843788864">
-    <w:abstractNumId w:val="31"/>
+    <w:abstractNumId w:val="32"/>
   </w:num>
   <w:num w:numId="13" w16cid:durableId="1167212978">
     <w:abstractNumId w:val="6"/>
   </w:num>
   <w:num w:numId="14" w16cid:durableId="1903982661">
-    <w:abstractNumId w:val="21"/>
+    <w:abstractNumId w:val="22"/>
   </w:num>
   <w:num w:numId="15" w16cid:durableId="415975022">
-    <w:abstractNumId w:val="29"/>
+    <w:abstractNumId w:val="30"/>
   </w:num>
   <w:num w:numId="16" w16cid:durableId="733623210">
     <w:abstractNumId w:val="15"/>
   </w:num>
   <w:num w:numId="17" w16cid:durableId="1251161969">
-    <w:abstractNumId w:val="35"/>
+    <w:abstractNumId w:val="37"/>
   </w:num>
   <w:num w:numId="18" w16cid:durableId="554586516">
-    <w:abstractNumId w:val="20"/>
+    <w:abstractNumId w:val="21"/>
   </w:num>
   <w:num w:numId="19" w16cid:durableId="1715231267">
-    <w:abstractNumId w:val="30"/>
+    <w:abstractNumId w:val="31"/>
     <w:lvlOverride w:ilvl="0">
       <w:startOverride w:val="1"/>
     </w:lvlOverride>
@@ -17085,16 +16710,16 @@
     <w:abstractNumId w:val="13"/>
   </w:num>
   <w:num w:numId="21" w16cid:durableId="866522873">
-    <w:abstractNumId w:val="25"/>
+    <w:abstractNumId w:val="26"/>
   </w:num>
   <w:num w:numId="22" w16cid:durableId="1871067339">
     <w:abstractNumId w:val="0"/>
   </w:num>
   <w:num w:numId="23" w16cid:durableId="187837387">
-    <w:abstractNumId w:val="22"/>
+    <w:abstractNumId w:val="23"/>
   </w:num>
   <w:num w:numId="24" w16cid:durableId="476728848">
-    <w:abstractNumId w:val="26"/>
+    <w:abstractNumId w:val="27"/>
   </w:num>
   <w:num w:numId="25" w16cid:durableId="82920648">
     <w:abstractNumId w:val="2"/>
@@ -17103,10 +16728,10 @@
     <w:abstractNumId w:val="9"/>
   </w:num>
   <w:num w:numId="27" w16cid:durableId="1050573208">
-    <w:abstractNumId w:val="34"/>
+    <w:abstractNumId w:val="36"/>
   </w:num>
   <w:num w:numId="28" w16cid:durableId="1520120920">
-    <w:abstractNumId w:val="33"/>
+    <w:abstractNumId w:val="35"/>
     <w:lvlOverride w:ilvl="0">
       <w:startOverride w:val="2"/>
     </w:lvlOverride>
@@ -17136,7 +16761,7 @@
     </w:lvlOverride>
   </w:num>
   <w:num w:numId="29" w16cid:durableId="36784669">
-    <w:abstractNumId w:val="33"/>
+    <w:abstractNumId w:val="35"/>
     <w:lvlOverride w:ilvl="0">
       <w:startOverride w:val="2"/>
     </w:lvlOverride>
@@ -17166,22 +16791,22 @@
     </w:lvlOverride>
   </w:num>
   <w:num w:numId="30" w16cid:durableId="1869053852">
-    <w:abstractNumId w:val="39"/>
+    <w:abstractNumId w:val="41"/>
   </w:num>
   <w:num w:numId="31" w16cid:durableId="42366784">
-    <w:abstractNumId w:val="37"/>
+    <w:abstractNumId w:val="39"/>
   </w:num>
   <w:num w:numId="32" w16cid:durableId="629290649">
     <w:abstractNumId w:val="17"/>
   </w:num>
   <w:num w:numId="33" w16cid:durableId="1558198328">
-    <w:abstractNumId w:val="32"/>
+    <w:abstractNumId w:val="33"/>
   </w:num>
   <w:num w:numId="34" w16cid:durableId="1119644012">
-    <w:abstractNumId w:val="28"/>
+    <w:abstractNumId w:val="29"/>
   </w:num>
   <w:num w:numId="35" w16cid:durableId="2068334547">
-    <w:abstractNumId w:val="24"/>
+    <w:abstractNumId w:val="25"/>
   </w:num>
   <w:num w:numId="36" w16cid:durableId="1698847598">
     <w:abstractNumId w:val="12"/>
@@ -17202,13 +16827,13 @@
     <w:abstractNumId w:val="16"/>
   </w:num>
   <w:num w:numId="42" w16cid:durableId="2007201318">
-    <w:abstractNumId w:val="38"/>
+    <w:abstractNumId w:val="40"/>
   </w:num>
   <w:num w:numId="43" w16cid:durableId="56707794">
-    <w:abstractNumId w:val="27"/>
+    <w:abstractNumId w:val="28"/>
   </w:num>
   <w:num w:numId="44" w16cid:durableId="1882861537">
-    <w:abstractNumId w:val="41"/>
+    <w:abstractNumId w:val="43"/>
   </w:num>
   <w:num w:numId="45" w16cid:durableId="981228981">
     <w:abstractNumId w:val="4"/>
@@ -17218,6 +16843,12 @@
   </w:num>
   <w:num w:numId="47" w16cid:durableId="1593850998">
     <w:abstractNumId w:val="19"/>
+  </w:num>
+  <w:num w:numId="48" w16cid:durableId="1947274300">
+    <w:abstractNumId w:val="20"/>
+  </w:num>
+  <w:num w:numId="49" w16cid:durableId="1830101026">
+    <w:abstractNumId w:val="34"/>
   </w:num>
   <w:numIdMacAtCleanup w:val="2"/>
 </w:numbering>
@@ -17621,7 +17252,7 @@
   <w:style w:type="paragraph" w:default="1" w:styleId="Normal">
     <w:name w:val="Normal"/>
     <w:qFormat/>
-    <w:rsid w:val="00301A8E"/>
+    <w:rsid w:val="00943A47"/>
     <w:pPr>
       <w:spacing w:before="120" w:after="0" w:line="240" w:lineRule="auto"/>
       <w:jc w:val="both"/>
@@ -17862,7 +17493,6 @@
   <w:style w:type="character" w:default="1" w:styleId="DefaultParagraphFont">
     <w:name w:val="Default Paragraph Font"/>
     <w:uiPriority w:val="1"/>
-    <w:semiHidden/>
     <w:unhideWhenUsed/>
   </w:style>
   <w:style w:type="table" w:default="1" w:styleId="TableNormal">
@@ -21031,12 +20661,7 @@
 </file>
 
 <file path=customXml/item2.xml><?xml version="1.0" encoding="utf-8"?>
-<?mso-contentType ?>
-<FormTemplates xmlns="http://schemas.microsoft.com/sharepoint/v3/contenttype/forms">
-  <Display>DocumentLibraryForm</Display>
-  <Edit>DocumentLibraryForm</Edit>
-  <New>DocumentLibraryForm</New>
-</FormTemplates>
+<b:Sources xmlns:b="http://schemas.openxmlformats.org/officeDocument/2006/bibliography" xmlns="http://schemas.openxmlformats.org/officeDocument/2006/bibliography" SelectedStyle="\APASixthEditionOfficeOnline.xsl" StyleName="APA" Version="6"/>
 </file>
 
 <file path=customXml/item3.xml><?xml version="1.0" encoding="utf-8"?>
@@ -21096,7 +20721,12 @@
 </file>
 
 <file path=customXml/item4.xml><?xml version="1.0" encoding="utf-8"?>
-<b:Sources xmlns:b="http://schemas.openxmlformats.org/officeDocument/2006/bibliography" xmlns="http://schemas.openxmlformats.org/officeDocument/2006/bibliography" SelectedStyle="\APASixthEditionOfficeOnline.xsl" StyleName="APA" Version="6"/>
+<?mso-contentType ?>
+<FormTemplates xmlns="http://schemas.microsoft.com/sharepoint/v3/contenttype/forms">
+  <Display>DocumentLibraryForm</Display>
+  <Edit>DocumentLibraryForm</Edit>
+  <New>DocumentLibraryForm</New>
+</FormTemplates>
 </file>
 
 <file path=customXml/item5.xml><?xml version="1.0" encoding="utf-8"?>
@@ -21381,9 +21011,9 @@
 </file>
 
 <file path=customXml/itemProps2.xml><?xml version="1.0" encoding="utf-8"?>
-<ds:datastoreItem xmlns:ds="http://schemas.openxmlformats.org/officeDocument/2006/customXml" ds:itemID="{029748EF-8199-4DDD-B6DF-F1878A51419F}">
+<ds:datastoreItem xmlns:ds="http://schemas.openxmlformats.org/officeDocument/2006/customXml" ds:itemID="{75FD708C-203E-4B8A-9075-BB4F7DDDF68C}">
   <ds:schemaRefs>
-    <ds:schemaRef ds:uri="http://schemas.microsoft.com/sharepoint/v3/contenttype/forms"/>
+    <ds:schemaRef ds:uri="http://schemas.openxmlformats.org/officeDocument/2006/bibliography"/>
   </ds:schemaRefs>
 </ds:datastoreItem>
 </file>
@@ -21401,9 +21031,9 @@
 </file>
 
 <file path=customXml/itemProps4.xml><?xml version="1.0" encoding="utf-8"?>
-<ds:datastoreItem xmlns:ds="http://schemas.openxmlformats.org/officeDocument/2006/customXml" ds:itemID="{75FD708C-203E-4B8A-9075-BB4F7DDDF68C}">
+<ds:datastoreItem xmlns:ds="http://schemas.openxmlformats.org/officeDocument/2006/customXml" ds:itemID="{029748EF-8199-4DDD-B6DF-F1878A51419F}">
   <ds:schemaRefs>
-    <ds:schemaRef ds:uri="http://schemas.openxmlformats.org/officeDocument/2006/bibliography"/>
+    <ds:schemaRef ds:uri="http://schemas.microsoft.com/sharepoint/v3/contenttype/forms"/>
   </ds:schemaRefs>
 </ds:datastoreItem>
 </file>

</xml_diff>